<commit_message>
Capstone Lab 1 updates
</commit_message>
<xml_diff>
--- a/spec/AGCP-Core.docx
+++ b/spec/AGCP-Core.docx
@@ -45,7 +45,7 @@
     </w:p>
     <w:p>
       <w:r>
-        <w:t>AGCP governs proposed transitions through commitment and operational realization. It ensures that qualified governance inputs are evaluated deterministically; authority at commitment is re-derived from current Canonical State and other qualified inputs; final admissibility is resolved at the Commit Boundary; and the resulting decision is applied through non-bypassable enforcement.</w:t>
+        <w:t>AGCP governs proposed transitions through commitment and operational realization. It ensures that qualified governance inputs are evaluated deterministically by the Governance Decision Function, which realizes the Policy Decision Point (PDP) functional role; favorable governance decisions may support Execution Authorization without becoming portable execution authority; the Governance Realization Function (GRF) re-establishes current Commit-Bound Admissibility from current qualified governance inputs; the GRF applies the controlling implementation-defined enforcement mapping, including a PEP Profile where one is defined, to construct the enforcement-facing context; and the Policy Enforcement Point (PEP) mediates the protected transition through non-bypassable enforcement.</w:t>
       </w:r>
     </w:p>
     <w:p>
@@ -95,7 +95,7 @@
         </w:numPr>
       </w:pPr>
       <w:r>
-        <w:t>evaluate governance policy;</w:t>
+        <w:t>evaluate governance policy through the Governance Decision Function / PDP;</w:t>
       </w:r>
     </w:p>
     <w:p>
@@ -106,7 +106,7 @@
         </w:numPr>
       </w:pPr>
       <w:r>
-        <w:t>authorize execution;</w:t>
+        <w:t>establish Execution Authorization without treating authorization as authority at commitment;</w:t>
       </w:r>
     </w:p>
     <w:p>
@@ -117,7 +117,7 @@
         </w:numPr>
       </w:pPr>
       <w:r>
-        <w:t>bind authorization to execution at the Commit Boundary;</w:t>
+        <w:t>establish current commit eligibility through Governance Realization and Commit-Bound Admissibility;</w:t>
       </w:r>
     </w:p>
     <w:p>
@@ -128,7 +128,18 @@
         </w:numPr>
       </w:pPr>
       <w:r>
-        <w:t>preserve governance integrity throughout execution; and</w:t>
+        <w:t>construct and preserve Governance Enforcement Binding and Enforcement Context through PEP mediation;</w:t>
+      </w:r>
+    </w:p>
+    <w:p>
+      <w:pPr>
+        <w:numPr>
+          <w:ilvl w:val="0"/>
+          <w:numId w:val="1"/>
+        </w:numPr>
+      </w:pPr>
+      <w:r>
+        <w:t>preserve governance integrity through operational realization; and</w:t>
       </w:r>
     </w:p>
     <w:p>
@@ -205,6 +216,16 @@
     </w:p>
     <w:p>
       <w:r>
+        <w:t>The AGCP Trust Model defines architectural trust relationships, principal classes, authority boundaries, and credential-separation concepts used by this specification. The Trust Model is non-normative and does not independently create conformance obligations.</w:t>
+      </w:r>
+    </w:p>
+    <w:p>
+      <w:r>
+        <w:t>Runtime Governance Engineering: Foundations and Architecture—From Governance Intent to Controlled Execution, Volume 1 (ISBN 979-8-9971149-0-9), provides non-normative explanatory architectural context for the decision, commitment, enforcement, and trust-boundary concepts used by AGCP. It is not part of AGCP normative precedence.</w:t>
+      </w:r>
+    </w:p>
+    <w:p>
+      <w:r>
         <w:t>The Requirements Traceability Matrix (RTM) provides traceability between requirements, architecture, this Core Specification, implementation artifacts, conformance tests, and assessment procedures.</w:t>
       </w:r>
     </w:p>
@@ -324,6 +345,28 @@
         </w:numPr>
       </w:pPr>
       <w:r>
+        <w:t>Governance Realization and Commit-Bound Admissibility;</w:t>
+      </w:r>
+    </w:p>
+    <w:p>
+      <w:pPr>
+        <w:numPr>
+          <w:ilvl w:val="0"/>
+          <w:numId w:val="2"/>
+        </w:numPr>
+      </w:pPr>
+      <w:r>
+        <w:t>Policy Enforcement Point mediation and Governance Enforcement Binding;</w:t>
+      </w:r>
+    </w:p>
+    <w:p>
+      <w:pPr>
+        <w:numPr>
+          <w:ilvl w:val="0"/>
+          <w:numId w:val="2"/>
+        </w:numPr>
+      </w:pPr>
+      <w:r>
         <w:t>Commit Boundary processing;</w:t>
       </w:r>
     </w:p>
@@ -480,7 +523,7 @@
         </w:numPr>
       </w:pPr>
       <w:r>
-        <w:t>identity management implementation;</w:t>
+        <w:t>identity, entitlement, and authorization-store implementation technology;</w:t>
       </w:r>
     </w:p>
     <w:p>
@@ -607,6 +650,11 @@
     <w:p>
       <w:r>
         <w:t>Companion specifications may define implementation guidance for these subjects where necessary.</w:t>
+      </w:r>
+    </w:p>
+    <w:p>
+      <w:r>
+        <w:t>Although a specific identity or entitlement-store technology is outside the scope of this Core Specification, qualification of governance-significant identity, account status, authorization, entitlements, roles, and authority data designated as authoritative by the controlling Implementation Profile remains within the scope of normative governance processing.</w:t>
       </w:r>
     </w:p>
     <w:p/>
@@ -791,6 +839,17 @@
         </w:numPr>
       </w:pPr>
       <w:r>
+        <w:t>AGCP Trust Model;</w:t>
+      </w:r>
+    </w:p>
+    <w:p>
+      <w:pPr>
+        <w:numPr>
+          <w:ilvl w:val="0"/>
+          <w:numId w:val="5"/>
+        </w:numPr>
+      </w:pPr>
+      <w:r>
         <w:t>Governed Action Proposal Representation Specification;</w:t>
       </w:r>
     </w:p>
@@ -1008,6 +1067,17 @@
         </w:numPr>
       </w:pPr>
       <w:r>
+        <w:t>AGCP Trust Model - architectural trust, principal, authority-boundary, and credential-separation reference; non-normative</w:t>
+      </w:r>
+    </w:p>
+    <w:p>
+      <w:pPr>
+        <w:numPr>
+          <w:ilvl w:val="0"/>
+          <w:numId w:val="6"/>
+        </w:numPr>
+      </w:pPr>
+      <w:r>
         <w:t>AGCP Normative Statements - extracted atomic obligations from the Core Specification</w:t>
       </w:r>
     </w:p>
@@ -1035,11 +1105,7 @@
     </w:p>
     <w:p>
       <w:r>
-        <w:t xml:space="preserve">The controlled Conformance Requirements and this Core Specification establish normative behavior. Applicable normative Companion Specifications may add profile-specific obligations only where expressly adopted. The ARM provides the authoritative architectural vocabulary used to interpret the normative sources but does not independently create conformance obligations. Normative Statements, the RTM, tests, </w:t>
-      </w:r>
-      <w:r>
-        <w:lastRenderedPageBreak/>
-        <w:t>assessments, implementation profiles, and reference implementations support extraction, traceability, verification, and implementation without superseding the normative sources.</w:t>
+        <w:t>The controlled Conformance Requirements and this Core Specification establish normative behavior. Applicable normative Companion Specifications may add profile-specific obligations only where expressly adopted. The ARM provides the authoritative architectural vocabulary used to interpret the normative sources, and the AGCP Trust Model provides the architectural trust and authority model; neither independently creates conformance obligations. Runtime Governance Engineering Volume 1 is an informative explanatory source and is outside AGCP normative precedence. Normative Statements, the RTM, tests, assessments, implementation profiles, and reference implementations support extraction, traceability, verification, and implementation without superseding the normative sources.</w:t>
       </w:r>
     </w:p>
     <w:p/>
@@ -1128,7 +1194,7 @@
     </w:p>
     <w:p>
       <w:r>
-        <w:t>No lower-precedence normative or verification artifact SHALL weaken, replace, or contradict a higher-precedence normative source. The ARM SHALL govern architectural terminology and concept meaning where the Core Specification uses an ARM-defined concept, provided that the ARM does not create an obligation absent from the controlled Conformance Requirements or this Core Specification.</w:t>
+        <w:t>No lower-precedence normative or verification artifact SHALL weaken, replace, or contradict a higher-precedence normative source. The ARM SHALL govern architectural terminology and concept meaning where the Core Specification uses an ARM-defined concept, provided that the ARM does not create an obligation absent from the controlled Conformance Requirements or this Core Specification. The AGCP Trust Model and Runtime Governance Engineering Volume 1 are informative architectural references and SHALL NOT be interpreted as independently creating or broadening conformance obligations.</w:t>
       </w:r>
     </w:p>
     <w:p/>
@@ -1571,7 +1637,7 @@
     </w:p>
     <w:p>
       <w:r>
-        <w:t>The governance determination that a qualified Proposal satisfies all requirements necessary to proceed to Commit Boundary processing.</w:t>
+        <w:t>The governance determination that a qualified Proposal satisfies the requirements applicable to the authorization evaluation horizon and may proceed toward Governance Realization and Commit Boundary processing.</w:t>
       </w:r>
     </w:p>
     <w:p>
@@ -1594,7 +1660,7 @@
     </w:p>
     <w:p>
       <w:r>
-        <w:t>The authoritative governance representation of operational reality used to evaluate admissibility and re-derive authority at the Commit Boundary.</w:t>
+        <w:t>The authoritative governance representation of operational reality used to evaluate admissibility and to support current Authority Re-Derivation and Commit-Bound Admissibility immediately before commitment.</w:t>
       </w:r>
     </w:p>
     <w:p>
@@ -1623,12 +1689,17 @@
     </w:p>
     <w:p>
       <w:r>
-        <w:t>The enforceable interface at which the final governance decision is applied and a proposed transition is either permitted to mutate authoritative operational state or prevented from doing so.</w:t>
-      </w:r>
-    </w:p>
-    <w:p>
-      <w:r>
-        <w:t>No governance-significant execution SHALL occur prior to successful Commit Boundary processing.</w:t>
+        <w:t>The enforceable architectural boundary at which a currently commit-eligible governed transition is either accepted into the protected PEP-mediated execution path for application to the intended target or prevented from producing the governed consequence.</w:t>
+      </w:r>
+    </w:p>
+    <w:p>
+      <w:r>
+        <w:t>No governance-significant consequence within the claimed enforcement scope SHALL occur without successful Governance Realization, Commit-Bound Admissibility, and PEP-mediated Commit Boundary processing.</w:t>
+      </w:r>
+    </w:p>
+    <w:p>
+      <w:r>
+        <w:t>Commitment is the governed acceptance of the exact transition for application to the intended target. Depending on the target and controlling Implementation Profile, commitment MAY coincide with completed operational execution or MAY precede a separately evidenced operational outcome.</w:t>
       </w:r>
     </w:p>
     <w:p/>
@@ -1715,12 +1786,17 @@
     </w:p>
     <w:p>
       <w:r>
-        <w:t>An attributable governance artifact or lifecycle outcome recording that a qualified Proposal satisfied an earlier governance evaluation and may proceed toward Commit Boundary processing, subject to current Canonical State Resolution, Authority Re-Derivation, Governance Binding Validation, and Commit-Bound Admissibility.</w:t>
+        <w:t>An attributable governance artifact or lifecycle outcome recording that a qualified Proposal satisfied an earlier governance evaluation and may proceed toward Governance Realization and Commit Boundary processing, subject to current Canonical State Resolution, Authority Re-Derivation, Governance Binding Validation, and Commit-Bound Admissibility.</w:t>
       </w:r>
     </w:p>
     <w:p>
       <w:r>
         <w:t>Execution Authorization SHALL NOT itself constitute authority at commitment, final execution admissibility, Governance Enforcement Binding, or permission to execute.</w:t>
+      </w:r>
+    </w:p>
+    <w:p>
+      <w:r>
+        <w:t>Execution Authorization is consumed by the Governance Realization Function when current commit eligibility is established.</w:t>
       </w:r>
     </w:p>
     <w:p/>
@@ -1743,8 +1819,47 @@
     </w:p>
     <w:p>
       <w:r>
-        <w:lastRenderedPageBreak/>
-        <w:t>The Governance Context Envelope may carry identity, authority, policy, Canonical State, tenant context, execution context, and other governance-significant attributes required by the applicable implementation profile.</w:t>
+        <w:t>The Governance Context Envelope may carry identity, account-status, authorization, entitlement, role, authority, policy, Canonical State, tenant context, execution context, and other governance-significant attributes required by the applicable implementation profile. Context-carried identity or entitlement assertions SHALL NOT supersede an authoritative source designated by the controlling Implementation Profile.</w:t>
+      </w:r>
+    </w:p>
+    <w:p>
+      <w:pPr>
+        <w:pStyle w:val="Heading2"/>
+      </w:pPr>
+      <w:r>
+        <w:t>4.12A Authoritative Identity and Authorization Source</w:t>
+      </w:r>
+    </w:p>
+    <w:p>
+      <w:pPr/>
+      <w:r>
+        <w:t>An implementation-profile-selected authoritative source used to qualify governance-significant human or workload identity, account status, roles, entitlements, authorization attributes, and other identity-bound authority data.</w:t>
+      </w:r>
+    </w:p>
+    <w:p>
+      <w:pPr/>
+      <w:r>
+        <w:t>Where the controlling Implementation Profile designates an identity store for this purpose, the associated IAS Profile SHALL identify the authoritative identity and authorization/entitlement attributes, their resolution and binding semantics, and their applicable validity or freshness basis. A claimant-supplied identity, role, entitlement, or authorization assertion SHALL NOT become authoritative merely by assertion.</w:t>
+      </w:r>
+    </w:p>
+    <w:p>
+      <w:pPr>
+        <w:pStyle w:val="Heading2"/>
+      </w:pPr>
+      <w:r>
+        <w:t>4.12B Identity and Authorization Store Profile (IAS Profile)</w:t>
+      </w:r>
+    </w:p>
+    <w:p>
+      <w:pPr/>
+      <w:r>
+        <w:t>An implementation-profile artifact, or integrity-bound referenced artifact, that identifies the authoritative identity store or equivalent identity-and-entitlement source used by the implementation and defines how governance-significant subjects are resolved and qualified.</w:t>
+      </w:r>
+    </w:p>
+    <w:p>
+      <w:pPr/>
+      <w:r>
+        <w:t>An IAS Profile includes, as applicable, stable subject and account identifiers, account-status semantics, roles, reviewer classes, authorization attributes, entitlements, tenant or governance-domain bindings, resolution rules, validity or freshness rules, and failure behavior. Detailed profile fields are defined by the applicable Implementation Profile specification and schema.</w:t>
       </w:r>
     </w:p>
     <w:p/>
@@ -1762,12 +1877,100 @@
     </w:p>
     <w:p>
       <w:r>
-        <w:t>The deterministic governance process that evaluates qualified Proposals against applicable governance policy and Canonical State.</w:t>
-      </w:r>
-    </w:p>
-    <w:p>
-      <w:r>
-        <w:t>The Governance Decision Function produces governance decisions but does not perform execution.</w:t>
+        <w:t>The deterministic governance process that evaluates qualified Proposals against applicable governance policy, qualified governance inputs, and Canonical State. Within AGCP, the Governance Decision Function realizes the Policy Decision Point (PDP) functional role.</w:t>
+      </w:r>
+    </w:p>
+    <w:p>
+      <w:r>
+        <w:t>The Governance Decision Function produces Governance Decisions but does not itself establish commit-bound execution eligibility, perform Governance Realization, enforce the decision, or perform operational execution.</w:t>
+      </w:r>
+    </w:p>
+    <w:p>
+      <w:pPr>
+        <w:pStyle w:val="Heading2"/>
+      </w:pPr>
+      <w:r>
+        <w:t>4.13A Governance Realization Function</w:t>
+      </w:r>
+    </w:p>
+    <w:p>
+      <w:pPr/>
+      <w:r>
+        <w:t>The logical AGCP function that determines whether an already-authorized proposed transition remains eligible to bind under current commitment-sensitive conditions and prepares the exact transition for protected enforcement.</w:t>
+      </w:r>
+    </w:p>
+    <w:p>
+      <w:pPr/>
+      <w:r>
+        <w:t>The Governance Realization Function performs or coordinates current Canonical State Resolution, State Qualification, Evidence Qualification, Authority Re-Derivation, Governance Binding Validation, Commit-Bound Admissibility, application of the controlling implementation-defined enforcement mapping, and construction of the Enforcement Context required by the Policy Enforcement Point.</w:t>
+      </w:r>
+    </w:p>
+    <w:p>
+      <w:pPr>
+        <w:pStyle w:val="Heading2"/>
+      </w:pPr>
+      <w:r>
+        <w:t>4.13B Policy Enforcement Point</w:t>
+      </w:r>
+    </w:p>
+    <w:p>
+      <w:pPr/>
+      <w:r>
+        <w:t>The architectural enforcement function positioned to permit a commit-eligible governed transition to cross the enforcement boundary or to prevent an invalid, stale, mismatched, unsupported, replayed, or otherwise ineligible transition from producing the governed consequence.</w:t>
+      </w:r>
+    </w:p>
+    <w:p>
+      <w:pPr/>
+      <w:r>
+        <w:t>The Policy Enforcement Point validates the execution-relevant governance bindings required by the controlling Implementation Profile and SHALL NOT independently reinterpret the Governance Decision into a broader or different governed operation.</w:t>
+      </w:r>
+    </w:p>
+    <w:p>
+      <w:pPr>
+        <w:pStyle w:val="Heading2"/>
+      </w:pPr>
+      <w:r>
+        <w:t>4.13C Enforcement Context</w:t>
+      </w:r>
+    </w:p>
+    <w:p>
+      <w:pPr/>
+      <w:r>
+        <w:t>The integrity-protected execution-relevant governance information made available to the Policy Enforcement Point for the exact governed transition, including the bindings required to determine whether the presented transition is the currently admissible transition.</w:t>
+      </w:r>
+    </w:p>
+    <w:p>
+      <w:pPr>
+        <w:pStyle w:val="Heading2"/>
+      </w:pPr>
+      <w:r>
+        <w:t>4.13D Governance Enforcement Binding</w:t>
+      </w:r>
+    </w:p>
+    <w:p>
+      <w:pPr/>
+      <w:r>
+        <w:t>The integrity relationship that preserves the association among Proposal Identity, Governance Decision, Execution Authorization, current commitment basis, action, target, tenant or governance domain, applicable state and evidence, lifecycle, validity, scope, enforcement mapping, Enforcement Context, and the governed consequence through enforcement.</w:t>
+      </w:r>
+    </w:p>
+    <w:p>
+      <w:pPr>
+        <w:pStyle w:val="Heading2"/>
+      </w:pPr>
+      <w:r>
+        <w:t>4.13E PEP Profile</w:t>
+      </w:r>
+    </w:p>
+    <w:p>
+      <w:pPr/>
+      <w:r>
+        <w:t>An implementation-profile artifact, or integrity-bound referenced artifact, that defines how the Governance Realization Function maps an exact commit-eligible governed transition and its required bindings into an operation supported by a selected Policy Enforcement Point.</w:t>
+      </w:r>
+    </w:p>
+    <w:p>
+      <w:pPr/>
+      <w:r>
+        <w:t>A PEP Profile defines or references the applicable PEP interface, supported governed actions and targets, required Enforcement Context, deterministic field and target mappings, permitted representation transformations, caller and target bindings where applicable, validity and replay constraints, outcome mappings, evidence requirements, and unsupported-operation behavior. A PEP Profile SHALL preserve governance meaning and SHALL NOT widen, substitute, or approximate an unsupported governed transition.</w:t>
       </w:r>
     </w:p>
     <w:p/>
@@ -2110,17 +2313,17 @@
     </w:p>
     <w:p>
       <w:r>
-        <w:t>Governance processing determines whether execution is permitted.</w:t>
-      </w:r>
-    </w:p>
-    <w:p>
-      <w:r>
-        <w:t>Execution performs the governed Action.</w:t>
-      </w:r>
-    </w:p>
-    <w:p>
-      <w:r>
-        <w:t>These responsibilities SHALL remain logically distinct even when implemented within the same software component.</w:t>
+        <w:t>Governance processing evaluates the proposal, records authorization where applicable, re-establishes current commit eligibility through Governance Realization, and prepares the exact transition for enforcement.</w:t>
+      </w:r>
+    </w:p>
+    <w:p>
+      <w:r>
+        <w:t>The Policy Enforcement Point mediates crossing of the protected execution boundary, and the execution system or governed target performs the operational Action.</w:t>
+      </w:r>
+    </w:p>
+    <w:p>
+      <w:r>
+        <w:t>Governance Decision, Execution Authorization, Governance Realization, Policy Enforcement Point enforcement, and operational execution SHALL remain logically distinct responsibilities even when two or more are implemented within the same software component or service.</w:t>
       </w:r>
     </w:p>
     <w:p/>
@@ -2192,7 +2395,7 @@
         </w:numPr>
       </w:pPr>
       <w:r>
-        <w:t>Governance Decision Function</w:t>
+        <w:t>Governance Decision Function / Policy Decision Point</w:t>
       </w:r>
     </w:p>
     <w:p>
@@ -2226,7 +2429,18 @@
         </w:numPr>
       </w:pPr>
       <w:r>
-        <w:t>Governance Realization and Commit Boundary processing</w:t>
+        <w:t>Governance Realization and Commit-Bound Admissibility</w:t>
+      </w:r>
+    </w:p>
+    <w:p>
+      <w:pPr>
+        <w:numPr>
+          <w:ilvl w:val="0"/>
+          <w:numId w:val="12"/>
+        </w:numPr>
+      </w:pPr>
+      <w:r>
+        <w:t>Policy Enforcement Point mediation at the Commit Boundary</w:t>
       </w:r>
     </w:p>
     <w:p>
@@ -2404,8 +2618,7 @@
         </w:numPr>
       </w:pPr>
       <w:r>
-        <w:lastRenderedPageBreak/>
-        <w:t>Commit Boundary integrity;</w:t>
+        <w:t>Commit Boundary and Governance Enforcement Binding integrity;</w:t>
       </w:r>
     </w:p>
     <w:p>
@@ -2499,7 +2712,7 @@
     </w:p>
     <w:p>
       <w:r>
-        <w:t>The Governance Decision Function evaluates the qualified Proposal using applicable governance policy and Canonical State.</w:t>
+        <w:t>The Governance Decision Function, acting in the PDP role, evaluates the qualified Proposal using applicable governance policy, qualified governance inputs, and Canonical State and renders the Governance Decision.</w:t>
       </w:r>
     </w:p>
     <w:p>
@@ -2509,7 +2722,12 @@
     </w:p>
     <w:p>
       <w:r>
-        <w:t>Immediately before commitment, the Governance Realization Function coordinates Canonical State Resolution, State Qualification, Evidence Qualification, Authority Re-Derivation, Governance Binding Validation, Commit-Bound Admissibility, and enforcement at the Commit Boundary.</w:t>
+        <w:t>Immediately before commitment, the Governance Realization Function coordinates current Canonical State Resolution, State Qualification, Evidence Qualification, Authority Re-Derivation, Governance Binding Validation, and Commit-Bound Admissibility; applies the controlling implementation-defined enforcement mapping, including the PEP Profile where one is defined; constructs the Enforcement Context; and presents the exact commit-eligible transition to the Policy Enforcement Point for enforcement at the Commit Boundary.</w:t>
+      </w:r>
+    </w:p>
+    <w:p>
+      <w:r>
+        <w:t>A conformant implementation MAY co-locate the Governance Decision Function, Governance Realization Function, or Policy Enforcement Point within one service, provided the logical responsibilities, ordering, bindings, refusal behavior, and evidence required by this specification remain independently testable.</w:t>
       </w:r>
     </w:p>
     <w:p>
@@ -2817,7 +3035,7 @@
         </w:numPr>
       </w:pPr>
       <w:r>
-        <w:t>identity information;</w:t>
+        <w:t>identity information and, where governance-significant, account-status, role, authorization, and entitlement information;</w:t>
       </w:r>
     </w:p>
     <w:p>
@@ -2970,6 +3188,28 @@
       </w:r>
     </w:p>
     <w:p>
+      <w:pPr>
+        <w:numPr>
+          <w:ilvl w:val="0"/>
+          <w:numId w:val="18"/>
+        </w:numPr>
+      </w:pPr>
+      <w:r>
+        <w:t>Where the controlling Implementation Profile designates an Authoritative Identity and Authorization Source, Proposal Qualification SHALL resolve or verify the governance-significant subject identity and any required account-status, role, authorization, or entitlement attributes from that source or from an integrity-protected authoritative reference to it.</w:t>
+      </w:r>
+    </w:p>
+    <w:p>
+      <w:pPr>
+        <w:numPr>
+          <w:ilvl w:val="0"/>
+          <w:numId w:val="18"/>
+        </w:numPr>
+      </w:pPr>
+      <w:r>
+        <w:t>A claimant-supplied identity, role, entitlement, reviewer class, or authorization value SHALL NOT be treated as authoritative merely because it appears in a Proposal, Governance Context, approval submission, or other client-controlled input.</w:t>
+      </w:r>
+    </w:p>
+    <w:p>
       <w:r>
         <w:t>Qualification SHALL complete before governance evaluation begins.</w:t>
       </w:r>
@@ -3128,6 +3368,11 @@
         <w:t>The Governance Context Envelope SHALL preserve attributable governance-relevant context and lineage across governed handoffs. It MAY inform evaluation but SHALL NOT override Canonical State. Context updates SHALL be attributable, versionable, and subject to qualification before use.</w:t>
       </w:r>
     </w:p>
+    <w:p>
+      <w:r>
+        <w:t>Where Governance Context references identity, authorization, role, or entitlement information governed by an Authoritative Identity and Authorization Source, those references SHALL remain subordinate to the authoritative source and applicable freshness or validity rules defined by the controlling Implementation Profile.</w:t>
+      </w:r>
+    </w:p>
     <w:p/>
     <w:p/>
     <w:p>
@@ -3184,7 +3429,7 @@
     </w:p>
     <w:p>
       <w:r>
-        <w:t>The Governance Decision Function determines the admissibility of a Qualified Proposal by evaluating it against the applicable governance policy using the authoritative Canonical State.</w:t>
+        <w:t>The Governance Decision Function, acting in the PDP functional role, determines the governance outcome for a Qualified Proposal by evaluating it against the applicable governance policy using qualified governance inputs and the authoritative Canonical State.</w:t>
       </w:r>
     </w:p>
     <w:p>
@@ -3195,6 +3440,11 @@
     <w:p>
       <w:r>
         <w:t>The Governance Decision Function SHALL NOT perform execution.</w:t>
+      </w:r>
+    </w:p>
+    <w:p>
+      <w:r>
+        <w:t>A Governance Decision produced by the Governance Decision Function SHALL NOT by itself establish current commit eligibility or permission to cross the enforcement boundary.</w:t>
       </w:r>
     </w:p>
     <w:p/>
@@ -3361,7 +3611,7 @@
         </w:numPr>
       </w:pPr>
       <w:r>
-        <w:t>applicable authority information; and</w:t>
+        <w:t>applicable qualified authority information, including authoritative identity-bound authorization or entitlement information where governance-significant; and</w:t>
       </w:r>
     </w:p>
     <w:p>
@@ -3636,6 +3886,11 @@
     </w:p>
     <w:p>
       <w:r>
+        <w:t>The Governance Decision Function MAY be re-invoked before commitment when Continuation Integrity or the Governance Realization Function determines that governed re-evaluation is required. Such re-invocation remains policy decision processing and does not collapse the Governance Decision Function into the Governance Realization Function.</w:t>
+      </w:r>
+    </w:p>
+    <w:p>
+      <w:r>
         <w:t>The Governance Decision Function SHALL satisfy the Global Governance Invariants defined in Section 5.</w:t>
       </w:r>
     </w:p>
@@ -3662,7 +3917,7 @@
     <w:p/>
     <w:p>
       <w:r>
-        <w:t>The Governance Decision Function SHALL evaluate applicable policy, constraints, invariants, authority evidence, qualified evidence, Canonical State, lifecycle conditions, ordering conditions, and proposal semantics for the applicable evaluation horizon.</w:t>
+        <w:t>The Governance Decision Function SHALL evaluate applicable policy, constraints, invariants, qualified identity and authority evidence, including current authorization or entitlement attributes where governance-significant, qualified evidence, Canonical State, lifecycle conditions, ordering conditions, and proposal semantics for the applicable evaluation horizon.</w:t>
       </w:r>
     </w:p>
     <w:p/>
@@ -3788,17 +4043,17 @@
     </w:p>
     <w:p>
       <w:r>
-        <w:t>Execution Authorization records that a proposal has satisfied an earlier governance evaluation and may proceed toward Commit Boundary processing, subject to renewed authority derivation, current-state resolution, binding validation, and Commit-Bound Admissibility.</w:t>
-      </w:r>
-    </w:p>
-    <w:p>
-      <w:r>
-        <w:t>Execution Authorization SHALL NOT be treated as portable executable authority. Final authority and admissibility SHALL be established from current qualified governance inputs at the Commit Boundary.</w:t>
-      </w:r>
-    </w:p>
-    <w:p>
-      <w:r>
-        <w:t>Execution Authorization SHALL complete before Commit Boundary processing begins.</w:t>
+        <w:t>Execution Authorization records that a proposal has satisfied an earlier governance evaluation and may proceed toward Governance Realization and Commit Boundary processing, subject to renewed Authority Re-Derivation, current-state resolution, Governance Binding Validation, and Commit-Bound Admissibility.</w:t>
+      </w:r>
+    </w:p>
+    <w:p>
+      <w:r>
+        <w:t>Execution Authorization SHALL NOT be treated as portable executable authority. Final current authority and Commit-Bound Admissibility SHALL be established by the Governance Realization Function from current qualified governance inputs immediately before protected enforcement.</w:t>
+      </w:r>
+    </w:p>
+    <w:p>
+      <w:r>
+        <w:t>Execution Authorization SHALL complete before Governance Realization and Commit Boundary processing begins.</w:t>
       </w:r>
     </w:p>
     <w:p>
@@ -3831,7 +4086,7 @@
     </w:p>
     <w:p>
       <w:r>
-        <w:t>Execution Authorization SHALL precede Commit Boundary processing, but a nonterminal proposal MAY remain pending between authorization and commitment and SHALL remain subject to lifecycle, continuation, expiration, cancellation, degradation, and re-evaluation controls.</w:t>
+        <w:t>Execution Authorization SHALL precede Governance Realization and Commit Boundary processing, but a nonterminal proposal MAY remain pending between authorization and commitment and SHALL remain subject to lifecycle, continuation, expiration, cancellation, degradation, and re-evaluation controls.</w:t>
       </w:r>
     </w:p>
     <w:p>
@@ -4058,6 +4313,17 @@
       </w:r>
     </w:p>
     <w:p>
+      <w:pPr>
+        <w:numPr>
+          <w:ilvl w:val="0"/>
+          <w:numId w:val="26"/>
+        </w:numPr>
+      </w:pPr>
+      <w:r>
+        <w:t>The validity checks performed by Execution Authorization apply to the authorization evaluation horizon and SHALL NOT substitute for current Authority Re-Derivation or Commit-Bound Admissibility performed by the Governance Realization Function immediately before commitment.</w:t>
+      </w:r>
+    </w:p>
+    <w:p>
       <w:r>
         <w:t>Execution Authorization SHALL NOT substitute for Commit-Bound Admissibility, Authority Re-Derivation, Governance Binding Validation, or Governance Decision Function invocation where current conditions require renewed evaluation.</w:t>
       </w:r>
@@ -4138,7 +4404,7 @@
     </w:p>
     <w:p>
       <w:r>
-        <w:t>Execution Authorization follows the Governance Decision Function and immediately precedes the Commit Boundary.</w:t>
+        <w:t>Execution Authorization follows the Governance Decision Function and precedes Governance Realization and the Commit Boundary. Continuation Integrity or governed re-evaluation MAY occur between authorization and commitment.</w:t>
       </w:r>
     </w:p>
     <w:p>
@@ -4148,7 +4414,7 @@
     </w:p>
     <w:p>
       <w:r>
-        <w:t>Successful Execution Authorization establishes the authoritative authorization consumed by the Commit Boundary.</w:t>
+        <w:t>Successful Execution Authorization establishes the authoritative authorization consumed by the Governance Realization Function during current commit-time processing.</w:t>
       </w:r>
     </w:p>
     <w:p>
@@ -4174,25 +4440,25 @@
         <w:pStyle w:val="Heading2"/>
       </w:pPr>
       <w:r>
-        <w:t>8.6A Authority Re-Derivation and Approval Artifacts</w:t>
+        <w:t>8.6A Authority Evidence and Approval Artifacts</w:t>
       </w:r>
     </w:p>
     <w:p/>
     <w:p>
       <w:r>
-        <w:t>Immediately before commitment, authority SHALL be re-derived for the specific proposal, target, tenant, governance domain, scope, lifecycle state, and validity horizon using current qualified governance inputs.</w:t>
+        <w:t>During Execution Authorization, applicable authority evidence and Governance Approval Artifacts SHALL be validated for the authorization evaluation horizon. This validation SHALL NOT replace the commit-time Authority Re-Derivation required by Sections 9 and 12.</w:t>
       </w:r>
     </w:p>
     <w:p/>
     <w:p>
       <w:r>
-        <w:t>Identity, authentication, standing permission, prior authorization, delegation, human approval, cosignature, quorum completion, or risk acceptance MAY contribute evidence but SHALL NOT by itself constitute authority at commitment or permission to execute.</w:t>
+        <w:t>Identity, authentication, current account status, role, authorization, entitlement, standing permission, prior authorization, delegation, human approval, cosignature, quorum completion, or risk acceptance MAY contribute evidence but SHALL NOT by itself constitute authority at commitment or permission to execute.</w:t>
       </w:r>
     </w:p>
     <w:p/>
     <w:p>
       <w:r>
-        <w:t>Authority Re-Derivation SHALL reflect revocation, expiration, tenant or subject status, delegation constraints, cross-domain boundaries, recursive authority containment, and current Canonical State.</w:t>
+        <w:t>Where authorization processing relies upon an Authoritative Identity and Authorization Source, relevant identity-bound roles, authorization attributes, and entitlements SHALL be qualified according to the controlling Implementation Profile and preserved as attributable authority evidence for subsequent current Authority Re-Derivation.</w:t>
       </w:r>
     </w:p>
     <w:p/>
@@ -4260,7 +4526,7 @@
         </w:numPr>
       </w:pPr>
       <w:r>
-        <w:t>prevent execution without successful Commit Boundary processing.</w:t>
+        <w:t>prevent execution without successful Governance Realization, Policy Enforcement Point mediation, and Commit Boundary processing.</w:t>
       </w:r>
     </w:p>
     <w:p>
@@ -4294,18 +4560,17 @@
     </w:p>
     <w:p>
       <w:r>
-        <w:t>The Commit Boundary is the deterministic execution boundary at which an authorized governance decision becomes an executed governance-significant Action.</w:t>
-      </w:r>
-    </w:p>
-    <w:p>
-      <w:r>
-        <w:t>The Commit Boundary SHALL be the enforceable interface at which final admissibility, authority at commitment, governance binding, and enforcement are resolved and applied immediately before a governed consequence can occur.</w:t>
-      </w:r>
-    </w:p>
-    <w:p>
-      <w:r>
-        <w:lastRenderedPageBreak/>
-        <w:t>No governance-significant execution SHALL occur prior to successful Commit Boundary processing.</w:t>
+        <w:t>The Commit Boundary is the deterministic protected execution boundary at which a currently commit-eligible governed transition is accepted for application to the intended target or is prevented from producing the governed consequence.</w:t>
+      </w:r>
+    </w:p>
+    <w:p>
+      <w:r>
+        <w:t>Immediately before the Commit Boundary is crossed, the Governance Realization Function SHALL establish final current authority, Governance Binding Validation, and Commit-Bound Admissibility and SHALL prepare the exact transition for Policy Enforcement Point mediation.</w:t>
+      </w:r>
+    </w:p>
+    <w:p>
+      <w:r>
+        <w:t>No governance-significant consequence within the claimed enforcement scope SHALL occur without successful Governance Realization, Commit-Bound Admissibility, and Policy Enforcement Point mediation at the Commit Boundary.</w:t>
       </w:r>
     </w:p>
     <w:p/>
@@ -4323,7 +4588,7 @@
     </w:p>
     <w:p>
       <w:r>
-        <w:t>The Commit Boundary operates only upon Actions that have successfully completed:</w:t>
+        <w:t>Governance Realization at the Commit Boundary SHALL operate only upon Actions that have successfully completed:</w:t>
       </w:r>
     </w:p>
     <w:p>
@@ -4345,7 +4610,7 @@
         </w:numPr>
       </w:pPr>
       <w:r>
-        <w:t>Governance Decision Function; and</w:t>
+        <w:t>Governance Decision Function;</w:t>
       </w:r>
     </w:p>
     <w:p>
@@ -4356,12 +4621,12 @@
         </w:numPr>
       </w:pPr>
       <w:r>
-        <w:t>Execution Authorization.</w:t>
-      </w:r>
-    </w:p>
-    <w:p>
-      <w:r>
-        <w:t>The Commit Boundary SHALL preserve deterministic governance behavior by binding authoritative execution authorization to execution immediately before the Action is committed.</w:t>
+        <w:t>Execution Authorization and any required Continuation Integrity or governed re-evaluation processing.</w:t>
+      </w:r>
+    </w:p>
+    <w:p>
+      <w:r>
+        <w:t>The Governance Realization Function SHALL preserve deterministic governance behavior by binding the authoritative Execution Authorization and current governance basis to the exact transition immediately before the transition is presented to the Policy Enforcement Point.</w:t>
       </w:r>
     </w:p>
     <w:p/>
@@ -4379,7 +4644,7 @@
     </w:p>
     <w:p>
       <w:r>
-        <w:t>The Commit Boundary SHALL operate upon:</w:t>
+        <w:t>Governance Realization and Commit processing SHALL operate upon:</w:t>
       </w:r>
     </w:p>
     <w:p>
@@ -4456,7 +4721,40 @@
         </w:numPr>
       </w:pPr>
       <w:r>
-        <w:t>governance configuration; and</w:t>
+        <w:t>governance configuration;</w:t>
+      </w:r>
+    </w:p>
+    <w:p>
+      <w:pPr>
+        <w:numPr>
+          <w:ilvl w:val="0"/>
+          <w:numId w:val="30"/>
+        </w:numPr>
+      </w:pPr>
+      <w:r>
+        <w:t>the current authoritative identity and entitlement basis where governance-significant;</w:t>
+      </w:r>
+    </w:p>
+    <w:p>
+      <w:pPr>
+        <w:numPr>
+          <w:ilvl w:val="0"/>
+          <w:numId w:val="30"/>
+        </w:numPr>
+      </w:pPr>
+      <w:r>
+        <w:t>the exact action and target binding;</w:t>
+      </w:r>
+    </w:p>
+    <w:p>
+      <w:pPr>
+        <w:numPr>
+          <w:ilvl w:val="0"/>
+          <w:numId w:val="30"/>
+        </w:numPr>
+      </w:pPr>
+      <w:r>
+        <w:t>the controlling enforcement mapping or PEP Profile, where applicable; and</w:t>
       </w:r>
     </w:p>
     <w:p>
@@ -4485,12 +4783,12 @@
         </w:rPr>
       </w:pPr>
       <w:r>
-        <w:t>9.4 Commit Processing</w:t>
-      </w:r>
-    </w:p>
-    <w:p>
-      <w:r>
-        <w:t>The Commit Boundary SHALL verify that:</w:t>
+        <w:t>9.4 Governance Realization and Commit Processing</w:t>
+      </w:r>
+    </w:p>
+    <w:p>
+      <w:r>
+        <w:t>The Governance Realization Function SHALL verify or coordinate verification that:</w:t>
       </w:r>
     </w:p>
     <w:p>
@@ -4501,7 +4799,7 @@
         </w:numPr>
       </w:pPr>
       <w:r>
-        <w:t>execution authorization remains valid;</w:t>
+        <w:t>Execution Authorization remains valid and bound to the same Proposal and Governance Decision;</w:t>
       </w:r>
     </w:p>
     <w:p>
@@ -4534,7 +4832,7 @@
         </w:numPr>
       </w:pPr>
       <w:r>
-        <w:t>required authority remains in effect;</w:t>
+        <w:t>current authority has been re-derived and remains in effect, including current identity-bound authorization or entitlement conditions where governance-significant;</w:t>
       </w:r>
     </w:p>
     <w:p>
@@ -4556,13 +4854,60 @@
         </w:numPr>
       </w:pPr>
       <w:r>
-        <w:t>governance configuration remains valid.</w:t>
-      </w:r>
-    </w:p>
-    <w:p>
-      <w:r>
-        <w:lastRenderedPageBreak/>
-        <w:t>The Commit Boundary SHALL bind the authoritative execution authorization to the governance-significant Action immediately before execution.</w:t>
+        <w:t>governance configuration remains valid;</w:t>
+      </w:r>
+    </w:p>
+    <w:p>
+      <w:pPr>
+        <w:numPr>
+          <w:ilvl w:val="0"/>
+          <w:numId w:val="31"/>
+        </w:numPr>
+      </w:pPr>
+      <w:r>
+        <w:t>required Canonical State and Governance Evidence remain sufficiently current and qualified;</w:t>
+      </w:r>
+    </w:p>
+    <w:p>
+      <w:pPr>
+        <w:numPr>
+          <w:ilvl w:val="0"/>
+          <w:numId w:val="31"/>
+        </w:numPr>
+      </w:pPr>
+      <w:r>
+        <w:t>lifecycle, validity, prior-use, replay, and single-use conditions remain satisfied;</w:t>
+      </w:r>
+    </w:p>
+    <w:p>
+      <w:pPr>
+        <w:numPr>
+          <w:ilvl w:val="0"/>
+          <w:numId w:val="31"/>
+        </w:numPr>
+      </w:pPr>
+      <w:r>
+        <w:t>the exact action, target, tenant, scope, and other commitment-sensitive bindings remain unchanged or are validly re-derived.</w:t>
+      </w:r>
+    </w:p>
+    <w:p>
+      <w:r>
+        <w:t>The Governance Realization Function SHALL bind the authoritative Execution Authorization and current commitment basis to the exact governance-significant transition immediately before protected enforcement.</w:t>
+      </w:r>
+    </w:p>
+    <w:p>
+      <w:r>
+        <w:t>Where the controlling Implementation Profile defines a PEP Profile or equivalent enforcement mapping, the Governance Realization Function SHALL apply that mapping to construct the enforcement-facing request and Enforcement Context without widening, substituting, or otherwise changing the governance-significant meaning of the commit-eligible transition.</w:t>
+      </w:r>
+    </w:p>
+    <w:p>
+      <w:r>
+        <w:t>If no supported enforcement mapping can faithfully represent the exact commit-eligible transition, the governed consequence SHALL NOT occur. The implementation SHALL follow the applicable Structural Refusal, failure, or governed re-evaluation path defined by this specification and the controlling Implementation Profile.</w:t>
+      </w:r>
+    </w:p>
+    <w:p>
+      <w:r>
+        <w:t>The Policy Enforcement Point SHALL validate the execution-relevant Enforcement Context and Governance Enforcement Binding required by the controlling Implementation Profile before permitting the transition to cross the enforcement boundary. The Policy Enforcement Point SHALL NOT reinterpret the Governance Decision into a broader or different operation.</w:t>
       </w:r>
     </w:p>
     <w:p>
@@ -4628,12 +4973,12 @@
     </w:p>
     <w:p>
       <w:r>
-        <w:t>A successful commit SHALL establish the authoritative transition from an authorized Proposal to an executed governance-significant Action.</w:t>
-      </w:r>
-    </w:p>
-    <w:p>
-      <w:r>
-        <w:t>Commit Failure SHALL prevent completion of the governed Action.</w:t>
+        <w:t>A successful commit SHALL establish the authoritative commitment event at which the governed execution path accepts the exact commit-eligible transition for application to the intended target. Where target execution is asynchronous or otherwise distinct from commitment, completion of the operational effect SHALL be represented by subsequent execution-outcome evidence rather than inferred from commit success alone.</w:t>
+      </w:r>
+    </w:p>
+    <w:p>
+      <w:r>
+        <w:t>Commit Failure SHALL prevent the transition from crossing the protected enforcement boundary for that commit attempt.</w:t>
       </w:r>
     </w:p>
     <w:p>
@@ -4656,7 +5001,7 @@
     </w:p>
     <w:p>
       <w:r>
-        <w:t>The Commit Boundary follows Execution Authorization.</w:t>
+        <w:t>The Commit Boundary follows Execution Authorization and any applicable Continuation Integrity or governed re-evaluation processing; the Governance Realization Function establishes current Commit-Bound Admissibility immediately before Policy Enforcement Point mediation.</w:t>
       </w:r>
     </w:p>
     <w:p>
@@ -4709,7 +5054,7 @@
     </w:p>
     <w:p>
       <w:r>
-        <w:t>No execution path within the claimed enforcement scope SHALL produce the governed consequence without mediation by the applicable governance-decision and Policy Enforcement Point mechanisms at or immediately adjacent to the Commit Boundary.</w:t>
+        <w:t>No execution path within the claimed enforcement scope SHALL produce the governed consequence without current Governance Realization, Governance Enforcement Binding, and Policy Enforcement Point mediation at or immediately adjacent to the Commit Boundary.</w:t>
       </w:r>
     </w:p>
     <w:p/>
@@ -4725,29 +5070,30 @@
     <w:p/>
     <w:p>
       <w:r>
-        <w:lastRenderedPageBreak/>
-        <w:t>Immediately before commitment, the Governance Realization Function SHALL coordinate current Canonical State Resolution, State Qualification, Evidence Qualification, Authority Re-Derivation, Governance Binding Validation, Commit-Bound Admissibility, and enforcement.</w:t>
+        <w:t>Immediately before commitment, the Governance Realization Function SHALL coordinate current Canonical State Resolution, State Qualification, Evidence Qualification, Authority Re-Derivation, Governance Binding Validation, Commit-Bound Admissibility, enforcement-mapping selection, Enforcement Context construction, and presentation of the exact commit-eligible transition to the Policy Enforcement Point.</w:t>
       </w:r>
     </w:p>
     <w:p/>
     <w:p>
       <w:r>
-        <w:t>Governance Binding Validation SHALL verify that the proposal remains bound to the same authority, authorization artifact, evidence, target, tenant, policy, Canonical State basis, scope, lifecycle state, validity window, governance version, and bind conditions evaluated by governance.</w:t>
+        <w:t>Governance Binding Validation SHALL verify that the proposal remains bound to the same qualified identity and authority basis, authorization artifact, Governance Decision, evidence, target, tenant, policy, Canonical State basis, scope, lifecycle state, validity window, governance version, and bind conditions evaluated by governance. Where current identity authorization or entitlement attributes are commitment-sensitive, the binding SHALL reflect the current qualified values obtained from the Authoritative Identity and Authorization Source designated by the controlling Implementation Profile.</w:t>
       </w:r>
     </w:p>
     <w:p/>
     <w:p>
       <w:r>
-        <w:t>The Policy Enforcement Point SHALL receive sufficient integrity-protected Enforcement Context to apply the decision to the specific proposal and governed consequence. The Policy Enforcement Point SHALL use the Enforcement Context to prevent execution when the Proposal, decision, authorization, target, tenant, state, evidence, lifecycle, validity, scope, or other applicable governance condition is inadmissible or mismatched. The Enforcement Context SHALL NOT replace Canonical State, the Governance Context En</w:t>
-      </w:r>
-      <w:r>
-        <w:t>velope, or the underlying Governance Evidence.</w:t>
+        <w:t>The Policy Enforcement Point SHALL receive sufficient integrity-protected Enforcement Context to enforce the current commit-eligible transition for the specific proposal and governed consequence. The Policy Enforcement Point SHALL use the Enforcement Context to prevent execution when the Proposal, Governance Decision, authorization, current commitment basis, target, tenant, state, evidence, lifecycle, validity, scope, enforcement mapping, or other applicable governance condition is inadmissible or mismatched. The Enforcement Context SHALL NOT replace Canonical State, the Governance Context Envelope, the Execution Authorization, or the underlying Governance Evidence.</w:t>
       </w:r>
     </w:p>
     <w:p/>
     <w:p>
       <w:r>
-        <w:t>Governance Enforcement Binding SHALL prevent decision, proposal, target, tenant, state, evidence, authorization, lifecycle, validity, or scope substitution, detachment, replay, or bypass during enforcement.</w:t>
+        <w:t>Governance Enforcement Binding SHALL prevent Governance Decision, proposal, target, tenant, state, evidence, authorization, commitment basis, lifecycle, validity, scope, enforcement mapping, or Enforcement Context substitution, detachment, replay, widening, or bypass during enforcement.</w:t>
+      </w:r>
+    </w:p>
+    <w:p>
+      <w:r>
+        <w:t>Where the Governance Realization Function and Policy Enforcement Point cross an independently authenticated service boundary, the controlling Implementation Profile SHALL define the authorized caller identity or equivalent protected caller binding. Where they are co-located, the implementation SHALL preserve equivalent logical authorization, binding, refusal, and evidence semantics.</w:t>
       </w:r>
     </w:p>
     <w:p/>
@@ -4836,7 +5182,7 @@
         </w:numPr>
       </w:pPr>
       <w:r>
-        <w:t>bind execution authorization directly to execution;</w:t>
+        <w:t>bind current commit eligibility and Execution Authorization to the exact enforced transition;</w:t>
       </w:r>
     </w:p>
     <w:p>
@@ -4858,12 +5204,12 @@
         </w:numPr>
       </w:pPr>
       <w:r>
-        <w:t>preserve deterministic execution ordering where governance semantics require ordering.</w:t>
-      </w:r>
-    </w:p>
-    <w:p>
-      <w:r>
-        <w:t>Execution outside the Commit Boundary, bypass of governance enforcement, use of consumed or invalid authorization, or non-deterministic Commit processing SHALL constitute non-conformance with this specification.</w:t>
+        <w:t>preserve deterministic execution ordering where governance semantics require ordering; and preserve Governance Enforcement Binding through Policy Enforcement Point mediation.</w:t>
+      </w:r>
+    </w:p>
+    <w:p>
+      <w:r>
+        <w:t>Execution outside the protected Commit Boundary path, bypass of Governance Realization or Policy Enforcement Point mediation, use of consumed or invalid authorization, loss of Governance Enforcement Binding, unsupported enforcement substitution, or non-deterministic Commit processing SHALL constitute non-conformance with this specification.</w:t>
       </w:r>
     </w:p>
     <w:p>
@@ -5064,7 +5410,29 @@
         </w:numPr>
       </w:pPr>
       <w:r>
-        <w:t>Commit Boundary processing;</w:t>
+        <w:t>Governance Realization and Commit-Bound Admissibility;</w:t>
+      </w:r>
+    </w:p>
+    <w:p>
+      <w:pPr>
+        <w:numPr>
+          <w:ilvl w:val="0"/>
+          <w:numId w:val="36"/>
+        </w:numPr>
+      </w:pPr>
+      <w:r>
+        <w:t>Policy Enforcement Point enforcement and Commit Boundary crossing;</w:t>
+      </w:r>
+    </w:p>
+    <w:p>
+      <w:pPr>
+        <w:numPr>
+          <w:ilvl w:val="0"/>
+          <w:numId w:val="36"/>
+        </w:numPr>
+      </w:pPr>
+      <w:r>
+        <w:t>operational target outcome processing where distinct from commitment;</w:t>
       </w:r>
     </w:p>
     <w:p>
@@ -5208,7 +5576,62 @@
         </w:numPr>
       </w:pPr>
       <w:r>
+        <w:t>Governance Realization and Commit-Bound Admissibility result;</w:t>
+      </w:r>
+    </w:p>
+    <w:p>
+      <w:pPr>
+        <w:numPr>
+          <w:ilvl w:val="0"/>
+          <w:numId w:val="37"/>
+        </w:numPr>
+      </w:pPr>
+      <w:r>
         <w:t>Commit Boundary outcome;</w:t>
+      </w:r>
+    </w:p>
+    <w:p>
+      <w:pPr>
+        <w:numPr>
+          <w:ilvl w:val="0"/>
+          <w:numId w:val="37"/>
+        </w:numPr>
+      </w:pPr>
+      <w:r>
+        <w:t>Enforcement Context or integrity-protected reference;</w:t>
+      </w:r>
+    </w:p>
+    <w:p>
+      <w:pPr>
+        <w:numPr>
+          <w:ilvl w:val="0"/>
+          <w:numId w:val="37"/>
+        </w:numPr>
+      </w:pPr>
+      <w:r>
+        <w:t>Policy Enforcement Point enforcement result;</w:t>
+      </w:r>
+    </w:p>
+    <w:p>
+      <w:pPr>
+        <w:numPr>
+          <w:ilvl w:val="0"/>
+          <w:numId w:val="37"/>
+        </w:numPr>
+      </w:pPr>
+      <w:r>
+        <w:t>PEP Profile or equivalent enforcement-mapping identity where applicable;</w:t>
+      </w:r>
+    </w:p>
+    <w:p>
+      <w:pPr>
+        <w:numPr>
+          <w:ilvl w:val="0"/>
+          <w:numId w:val="37"/>
+        </w:numPr>
+      </w:pPr>
+      <w:r>
+        <w:t>operational target outcome where distinct from commitment;</w:t>
       </w:r>
     </w:p>
     <w:p>
@@ -5559,7 +5982,18 @@
         </w:numPr>
       </w:pPr>
       <w:r>
-        <w:t>Commit Boundary processing; and</w:t>
+        <w:t>Governance Realization and Commit-Bound Admissibility;</w:t>
+      </w:r>
+    </w:p>
+    <w:p>
+      <w:pPr>
+        <w:numPr>
+          <w:ilvl w:val="0"/>
+          <w:numId w:val="40"/>
+        </w:numPr>
+      </w:pPr>
+      <w:r>
+        <w:t>Policy Enforcement Point enforcement decision and binding interpretation; and</w:t>
       </w:r>
     </w:p>
     <w:p>
@@ -5625,13 +6059,13 @@
     <w:p/>
     <w:p>
       <w:r>
-        <w:t>The Governance Ledger SHALL be append-only and SHALL record or reference submissions, decisions, approvals, refusals, commitments, enforcement outcomes, lifecycle transitions, continuation events, and associated evidence references with ordering integrity sufficient for reconstruction.</w:t>
+        <w:t>The Governance Ledger SHALL be append-only and SHALL record or reference submissions, decisions, approvals, refusals, authorization results, Governance Realization and Commit-Bound Admissibility results, commitments, enforcement outcomes, target outcomes where distinct, lifecycle transitions, continuation events, and associated evidence references with ordering integrity sufficient for reconstruction.</w:t>
       </w:r>
     </w:p>
     <w:p/>
     <w:p>
       <w:r>
-        <w:t>Governance Evidence SHALL preserve Evidence Continuity and the Provenance Chain across proposal formation, context, evidence, authority, evaluation, enforcement, handoff, lifecycle transition, and outcome.</w:t>
+        <w:t>Governance Evidence SHALL preserve Evidence Continuity and the Provenance Chain across proposal formation, context, identity and entitlement qualification where applicable, evidence, authority, governance evaluation, authorization, Governance Realization, commitment, enforcement, handoff, lifecycle transition, target outcome, and resulting state.</w:t>
       </w:r>
     </w:p>
     <w:p/>
@@ -5822,7 +6256,18 @@
         </w:numPr>
       </w:pPr>
       <w:r>
-        <w:t>Commit Boundary processing;</w:t>
+        <w:t>Governance Realization and Commit-Bound Admissibility;</w:t>
+      </w:r>
+    </w:p>
+    <w:p>
+      <w:pPr>
+        <w:numPr>
+          <w:ilvl w:val="0"/>
+          <w:numId w:val="42"/>
+        </w:numPr>
+      </w:pPr>
+      <w:r>
+        <w:t>Policy Enforcement Point mediation and Governance Enforcement Binding;</w:t>
       </w:r>
     </w:p>
     <w:p>
@@ -6271,7 +6716,7 @@
     </w:p>
     <w:p>
       <w:r>
-        <w:t>Authority SHALL be derived for the specific proposal and target from current qualified governance inputs and SHALL NOT be inferred, cached as portable permission, or assumed from identity, authentication, approval, delegation, or prior authorization alone.</w:t>
+        <w:t>Authority SHALL be derived for the specific proposal and target from current qualified governance inputs and SHALL NOT be inferred, cached as portable permission, or assumed from identity, authentication, role, entitlement, approval, delegation, or prior authorization alone.</w:t>
       </w:r>
     </w:p>
     <w:p/>
@@ -6300,6 +6745,11 @@
     </w:p>
     <w:p>
       <w:r>
+        <w:t>Where the controlling Implementation Profile designates an Authoritative Identity and Authorization Source, current account status and any identity-bound roles, authorization attributes, or entitlements material to authority SHALL participate in Authority Re-Derivation according to the source validity and freshness semantics defined by that profile.</w:t>
+      </w:r>
+    </w:p>
+    <w:p>
+      <w:r>
         <w:t>Delegation SHALL remain attributable, constrained, verifiable, revocable, and bounded. A delegation artifact is evidence used in Authority Re-Derivation and SHALL NOT itself constitute unconditional execution authority.</w:t>
       </w:r>
     </w:p>
@@ -6340,6 +6790,28 @@
         </w:numPr>
       </w:pPr>
       <w:r>
+        <w:t>qualified subject identity and account status;</w:t>
+      </w:r>
+    </w:p>
+    <w:p>
+      <w:pPr>
+        <w:numPr>
+          <w:ilvl w:val="0"/>
+          <w:numId w:val="47"/>
+        </w:numPr>
+      </w:pPr>
+      <w:r>
+        <w:t>qualified identity-bound roles, authorization attributes, and entitlements where governance-significant;</w:t>
+      </w:r>
+    </w:p>
+    <w:p>
+      <w:pPr>
+        <w:numPr>
+          <w:ilvl w:val="0"/>
+          <w:numId w:val="47"/>
+        </w:numPr>
+      </w:pPr>
+      <w:r>
         <w:t>delegating authority;</w:t>
       </w:r>
     </w:p>
@@ -6440,6 +6912,28 @@
         </w:numPr>
       </w:pPr>
       <w:r>
+        <w:t>validate the current authoritative subject identity and account status where material;</w:t>
+      </w:r>
+    </w:p>
+    <w:p>
+      <w:pPr>
+        <w:numPr>
+          <w:ilvl w:val="0"/>
+          <w:numId w:val="48"/>
+        </w:numPr>
+      </w:pPr>
+      <w:r>
+        <w:t>validate current identity-bound roles, authorization attributes, and entitlements where they participate in execution authority;</w:t>
+      </w:r>
+    </w:p>
+    <w:p>
+      <w:pPr>
+        <w:numPr>
+          <w:ilvl w:val="0"/>
+          <w:numId w:val="48"/>
+        </w:numPr>
+      </w:pPr>
+      <w:r>
         <w:t>establish Authority Lineage;</w:t>
       </w:r>
     </w:p>
@@ -6628,6 +7122,11 @@
     </w:p>
     <w:p>
       <w:r>
+        <w:t>Immediately before commitment, the Governance Realization Function SHALL perform or consume current Authority Re-Derivation sufficient to establish the authority applicable to the exact proposal, action, target, tenant or governance domain, scope, lifecycle state, and validity horizon.</w:t>
+      </w:r>
+    </w:p>
+    <w:p>
+      <w:r>
         <w:t>Continuation Integrity SHALL evaluate continued authority validity throughout the applicable nonterminal pre-commit lifecycle until final Commit-Bound Admissibility is resolved.</w:t>
       </w:r>
     </w:p>
@@ -7273,7 +7772,12 @@
     </w:p>
     <w:p>
       <w:r>
-        <w:t>Commit Boundary processing SHALL satisfy the requirements of Section 9.</w:t>
+        <w:t>Governance Realization and Commit-Bound Admissibility SHALL satisfy the requirements of Section 9.</w:t>
+      </w:r>
+    </w:p>
+    <w:p>
+      <w:r>
+        <w:t>Policy Enforcement Point mediation and Commit Boundary processing SHALL satisfy the requirements of Section 9.</w:t>
       </w:r>
     </w:p>
     <w:p>
@@ -7350,7 +7854,17 @@
     <w:p/>
     <w:p>
       <w:r>
-        <w:t>Human adjudication, approval, negative adjudication, cosignature, risk acceptance, and quorum SHALL be represented by cryptographically attributable and verifiable Governance Approval Artifacts bound to eligible Proposal Identity, lifecycle state, scope, tenant, and validity conditions.</w:t>
+        <w:t>Human adjudication, approval, negative adjudication, cosignature, risk acceptance, and quorum SHALL be represented by cryptographically attributable and verifiable Governance Approval Artifacts bound to an independently qualified human subject, eligible Proposal Identity, lifecycle state, scope, tenant or governance domain, and validity conditions. A claimant-supplied reviewer identity, role, authorization, or entitlement SHALL NOT by itself establish authoritative human governance authority.</w:t>
+      </w:r>
+    </w:p>
+    <w:p>
+      <w:r>
+        <w:t>Where the controlling Implementation Profile designates an identity store as authoritative for human governance identity and authorization/entitlement data, the applicable IAS Profile SHALL identify the account-status, role, reviewer-class, authorization, and entitlement attributes used to qualify the human governance principal. Required attributes SHALL be resolved from that authoritative source or from an integrity-protected authoritative reference to it.</w:t>
+      </w:r>
+    </w:p>
+    <w:p>
+      <w:r>
+        <w:t>Human governance identity and authority that are commitment-sensitive SHALL remain subject to current Authority Re-Derivation before commitment, including revocation, account disablement, role or entitlement change, delegation change, or other profile-defined loss of authority.</w:t>
       </w:r>
     </w:p>
     <w:p/>
@@ -8239,6 +8753,39 @@
         </w:numPr>
       </w:pPr>
       <w:r>
+        <w:t>Governance Realization logic;</w:t>
+      </w:r>
+    </w:p>
+    <w:p>
+      <w:pPr>
+        <w:numPr>
+          <w:ilvl w:val="0"/>
+          <w:numId w:val="60"/>
+        </w:numPr>
+      </w:pPr>
+      <w:r>
+        <w:t>PEP Profiles or equivalent enforcement mappings;</w:t>
+      </w:r>
+    </w:p>
+    <w:p>
+      <w:pPr>
+        <w:numPr>
+          <w:ilvl w:val="0"/>
+          <w:numId w:val="60"/>
+        </w:numPr>
+      </w:pPr>
+      <w:r>
+        <w:t>Policy Enforcement Point configuration and protected target bindings;</w:t>
+      </w:r>
+    </w:p>
+    <w:p>
+      <w:pPr>
+        <w:numPr>
+          <w:ilvl w:val="0"/>
+          <w:numId w:val="60"/>
+        </w:numPr>
+      </w:pPr>
+      <w:r>
         <w:t>execution authorization logic;</w:t>
       </w:r>
     </w:p>
@@ -8273,6 +8820,17 @@
       </w:pPr>
       <w:r>
         <w:t>Canonical State definitions;</w:t>
+      </w:r>
+    </w:p>
+    <w:p>
+      <w:pPr>
+        <w:numPr>
+          <w:ilvl w:val="0"/>
+          <w:numId w:val="60"/>
+        </w:numPr>
+      </w:pPr>
+      <w:r>
+        <w:t>Authoritative Identity and Authorization Source bindings and IAS Profiles;</w:t>
       </w:r>
     </w:p>
     <w:p>
@@ -8655,6 +9213,28 @@
         </w:numPr>
       </w:pPr>
       <w:r>
+        <w:t>Governance Realization Function;</w:t>
+      </w:r>
+    </w:p>
+    <w:p>
+      <w:pPr>
+        <w:numPr>
+          <w:ilvl w:val="0"/>
+          <w:numId w:val="64"/>
+        </w:numPr>
+      </w:pPr>
+      <w:r>
+        <w:t>Policy Enforcement Point and Governance Enforcement Binding;</w:t>
+      </w:r>
+    </w:p>
+    <w:p>
+      <w:pPr>
+        <w:numPr>
+          <w:ilvl w:val="0"/>
+          <w:numId w:val="64"/>
+        </w:numPr>
+      </w:pPr>
+      <w:r>
         <w:t>Commit Boundary;</w:t>
       </w:r>
     </w:p>
@@ -8738,7 +9318,7 @@
     <w:p/>
     <w:p>
       <w:r>
-        <w:t>Governance-significant configuration SHALL be explicit, attributable, versioned, and available for governance evaluation. Hidden or implicit configuration SHALL NOT influence governance decisions.</w:t>
+        <w:t>Governance-significant configuration SHALL be explicit, attributable, versioned, and available for governance evaluation and realization. This includes authoritative identity and entitlement source bindings, IAS Profile selection, enforcement-mapping or PEP Profile selection, and protected target bindings where applicable. Hidden or implicit configuration SHALL NOT influence governance decisions, Authority Re-Derivation, Commit-Bound Admissibility, or enforcement.</w:t>
       </w:r>
     </w:p>
     <w:p/>
@@ -9145,7 +9725,7 @@
         </w:numPr>
       </w:pPr>
       <w:r>
-        <w:t>all required coordinated Commit Boundary operations SHALL succeed; or</w:t>
+        <w:t>all required coordinated Governance Realization, Policy Enforcement Point, and Commit Boundary operations SHALL succeed; or</w:t>
       </w:r>
     </w:p>
     <w:p>
@@ -9252,7 +9832,12 @@
     </w:p>
     <w:p>
       <w:r>
-        <w:t>Commit Boundary processing SHALL preserve the governance semantics of coordinated execution.</w:t>
+        <w:t>Governance Realization SHALL establish current Commit-Bound Admissibility for every governed participant or sub-transition whose effect is required by the coordinated operation.</w:t>
+      </w:r>
+    </w:p>
+    <w:p>
+      <w:r>
+        <w:t>Policy Enforcement Point mediation and Commit Boundary processing SHALL preserve the governance semantics, dependencies, coupling rules, and Governance Enforcement Binding of coordinated execution.</w:t>
       </w:r>
     </w:p>
     <w:p>
@@ -9546,7 +10131,7 @@
         </w:numPr>
       </w:pPr>
       <w:r>
-        <w:t>Governance Decision Function;</w:t>
+        <w:t>Governance Decision Function / Policy Decision Point;</w:t>
       </w:r>
     </w:p>
     <w:p>
@@ -9568,7 +10153,18 @@
         </w:numPr>
       </w:pPr>
       <w:r>
-        <w:t>Commit Boundary; and</w:t>
+        <w:t>Governance Realization and Commit-Bound Admissibility;</w:t>
+      </w:r>
+    </w:p>
+    <w:p>
+      <w:pPr>
+        <w:numPr>
+          <w:ilvl w:val="0"/>
+          <w:numId w:val="72"/>
+        </w:numPr>
+      </w:pPr>
+      <w:r>
+        <w:t>Policy Enforcement Point mediation, Governance Enforcement Binding, and Commit Boundary processing; and</w:t>
       </w:r>
     </w:p>
     <w:p>
@@ -9834,12 +10430,72 @@
         </w:numPr>
       </w:pPr>
       <w:r>
+        <w:t>authoritative identity and entitlement source bindings, including an IAS Profile or equivalent declaration where such a source is used;</w:t>
+      </w:r>
+    </w:p>
+    <w:p>
+      <w:pPr>
+        <w:numPr>
+          <w:ilvl w:val="0"/>
+          <w:numId w:val="75"/>
+        </w:numPr>
+      </w:pPr>
+      <w:r>
+        <w:t>Governance Decision Function / PDP and Governance Realization deployment or trust-boundary mappings;</w:t>
+      </w:r>
+    </w:p>
+    <w:p>
+      <w:pPr>
+        <w:numPr>
+          <w:ilvl w:val="0"/>
+          <w:numId w:val="75"/>
+        </w:numPr>
+      </w:pPr>
+      <w:r>
+        <w:t>GRF-to-PEP protected caller and interface bindings where applicable;</w:t>
+      </w:r>
+    </w:p>
+    <w:p>
+      <w:pPr>
+        <w:numPr>
+          <w:ilvl w:val="0"/>
+          <w:numId w:val="75"/>
+        </w:numPr>
+      </w:pPr>
+      <w:r>
+        <w:t>PEP Profiles or equivalent enforcement mappings, supported action/target mappings, and protected target bindings;</w:t>
+      </w:r>
+    </w:p>
+    <w:p>
+      <w:pPr>
+        <w:numPr>
+          <w:ilvl w:val="0"/>
+          <w:numId w:val="75"/>
+        </w:numPr>
+      </w:pPr>
+      <w:r>
+        <w:t>commitment-event and execution-outcome semantics where the target distinguishes commitment from later operational completion;</w:t>
+      </w:r>
+    </w:p>
+    <w:p>
+      <w:pPr>
+        <w:numPr>
+          <w:ilvl w:val="0"/>
+          <w:numId w:val="75"/>
+        </w:numPr>
+      </w:pPr>
+      <w:r>
         <w:t>implementation guidance.</w:t>
       </w:r>
     </w:p>
     <w:p>
       <w:r>
         <w:t>Implementation Profiles SHALL NOT redefine mandatory normative behavior established by this Core Specification.</w:t>
+      </w:r>
+    </w:p>
+    <w:p>
+      <w:r>
+        <w:t>Where conformance relies upon an implementation-selected Authoritative Identity and Authorization Source, IAS Profile, PEP Profile, or equivalent realization binding, the Implementation Profile SHALL identify the selected artifact or source with sufficient integrity and version information to support deterministic interpretation, governance evidence, and conformance assessment. Detailed profile fields are defined by the applicable Implementation Profile specification and schema rather than by this Core Specification.</w:t>
       </w:r>
     </w:p>
     <w:p/>
@@ -10303,7 +10959,7 @@
         </w:numPr>
       </w:pPr>
       <w:r>
-        <w:t xml:space="preserve">execution authority is validated immediately before execution; </w:t>
+        <w:t>current execution authority and identity-bound authorization/entitlement conditions are re-derived immediately before commitment where applicable;</w:t>
       </w:r>
     </w:p>
     <w:p>
@@ -10314,7 +10970,7 @@
         </w:numPr>
       </w:pPr>
       <w:r>
-        <w:t xml:space="preserve">execution authorization is bound to execution at the Commit Boundary; and </w:t>
+        <w:t>the Governance Realization Function binds current commit eligibility to a PEP-mediated enforcement request at the Commit Boundary; and</w:t>
       </w:r>
     </w:p>
     <w:p>
@@ -10354,89 +11010,62 @@
     <w:p>
       <w:r>
         <w:t>Proposal</w:t>
-      </w:r>
-      <w:r>
         <w:br/>
         <w:t xml:space="preserve">    │</w:t>
-      </w:r>
-      <w:r>
         <w:br/>
         <w:t xml:space="preserve">    ▼</w:t>
-      </w:r>
-      <w:r>
         <w:br/>
         <w:t>Proposal Qualification</w:t>
-      </w:r>
-      <w:r>
         <w:br/>
         <w:t xml:space="preserve">    │</w:t>
-      </w:r>
-      <w:r>
         <w:br/>
         <w:t xml:space="preserve">    ▼</w:t>
-      </w:r>
-      <w:r>
         <w:br/>
-        <w:t>Governance Decision Function</w:t>
-      </w:r>
-      <w:r>
+        <w:t>Governance Decision Function / PDP</w:t>
         <w:br/>
         <w:t xml:space="preserve">    │</w:t>
-      </w:r>
-      <w:r>
         <w:br/>
         <w:t xml:space="preserve">    ▼</w:t>
-      </w:r>
-      <w:r>
         <w:br/>
         <w:t>Execution Authorization / Eligible Nonterminal State</w:t>
-      </w:r>
-      <w:r>
         <w:br/>
         <w:t xml:space="preserve">    │</w:t>
-      </w:r>
-      <w:r>
         <w:br/>
         <w:t xml:space="preserve">    ├── Continuation Integrity, Risk-Based Re-Evaluation, or Recovery as applicable</w:t>
-      </w:r>
-      <w:r>
         <w:br/>
         <w:t xml:space="preserve">    │</w:t>
-      </w:r>
-      <w:r>
         <w:br/>
         <w:t xml:space="preserve">    ▼</w:t>
-      </w:r>
-      <w:r>
         <w:br/>
         <w:t>Governance Realization and Commit-Bound Admissibility</w:t>
-      </w:r>
-      <w:r>
         <w:br/>
         <w:t xml:space="preserve">    │</w:t>
-      </w:r>
-      <w:r>
+        <w:br/>
+        <w:t xml:space="preserve">    ├── Apply PEP Profile / enforcement mapping</w:t>
+        <w:br/>
+        <w:t xml:space="preserve">    ├── Construct Enforcement Context</w:t>
         <w:br/>
         <w:t xml:space="preserve">    ▼</w:t>
-      </w:r>
-      <w:r>
         <w:br/>
-      </w:r>
-      <w:r>
-        <w:lastRenderedPageBreak/>
-        <w:t>Commit Boundary and Policy Enforcement Point</w:t>
-      </w:r>
-      <w:r>
+        <w:t>Policy Enforcement Point</w:t>
         <w:br/>
         <w:t xml:space="preserve">    │</w:t>
-      </w:r>
-      <w:r>
         <w:br/>
         <w:t xml:space="preserve">    ▼</w:t>
-      </w:r>
-      <w:r>
         <w:br/>
-        <w:t>Governed Execution</w:t>
+        <w:t>Commit Boundary crossing</w:t>
+        <w:br/>
+        <w:t xml:space="preserve">    │</w:t>
+        <w:br/>
+        <w:t xml:space="preserve">    ▼</w:t>
+        <w:br/>
+        <w:t>Governed Target Realization</w:t>
+        <w:br/>
+        <w:t xml:space="preserve">    │</w:t>
+        <w:br/>
+        <w:t xml:space="preserve">    ▼</w:t>
+        <w:br/>
+        <w:t>Execution Outcome / Evidence</w:t>
       </w:r>
     </w:p>
     <w:p>
@@ -10641,7 +11270,7 @@
     </w:p>
     <w:p>
       <w:r>
-        <w:t>The Governance Decision Function performs deterministic governance evaluation using:</w:t>
+        <w:t>The Governance Decision Function, acting in the PDP role, performs deterministic governance evaluation using:</w:t>
       </w:r>
     </w:p>
     <w:p>
@@ -10702,7 +11331,7 @@
     </w:p>
     <w:p>
       <w:r>
-        <w:t>This stage produces one or more authoritative governance decisions.</w:t>
+        <w:t>This stage produces one or more authoritative Governance Decisions. A Governance Decision does not by itself establish current commit eligibility.</w:t>
       </w:r>
     </w:p>
     <w:p/>
@@ -10785,7 +11414,7 @@
     </w:p>
     <w:p>
       <w:r>
-        <w:t>Successful completion produces an authorization artifact that remains subject to current-state qualification, Authority Re-Derivation, Governance Binding Validation, and Commit-Bound Admissibility.</w:t>
+        <w:t>Successful completion produces an authorization artifact that remains subject to current-state qualification, Authority Re-Derivation, Governance Binding Validation, Commit-Bound Admissibility, and PEP-mediated enforcement.</w:t>
       </w:r>
     </w:p>
     <w:p/>
@@ -10798,22 +11427,22 @@
         </w:rPr>
       </w:pPr>
       <w:r>
-        <w:t>A.4.4 Commit Boundary</w:t>
-      </w:r>
-    </w:p>
-    <w:p>
-      <w:r>
-        <w:t>The Commit Boundary is the architectural location at which execution authorization is deterministically bound to execution.</w:t>
-      </w:r>
-    </w:p>
-    <w:p>
-      <w:r>
-        <w:t>No governance-significant execution occurs before successful Commit Boundary processing.</w:t>
-      </w:r>
-    </w:p>
-    <w:p>
-      <w:r>
-        <w:t>Successful completion establishes the governed transition from authorized intent to executed action.</w:t>
+        <w:t>A.4.4 Governance Realization and Commit Boundary</w:t>
+      </w:r>
+    </w:p>
+    <w:p>
+      <w:r>
+        <w:t>The Governance Realization Function establishes current Commit-Bound Admissibility and prepares the exact commit-eligible transition for Policy Enforcement Point mediation at the Commit Boundary.</w:t>
+      </w:r>
+    </w:p>
+    <w:p>
+      <w:r>
+        <w:t>The Governance Realization Function applies the controlling enforcement mapping, constructs the Enforcement Context, and preserves Governance Enforcement Binding. No governed consequence occurs through the claimed enforcement scope without successful PEP-mediated Commit Boundary processing.</w:t>
+      </w:r>
+    </w:p>
+    <w:p>
+      <w:r>
+        <w:t>Successful commitment establishes acceptance of the exact transition for application to the intended target; completed target execution may coincide with commitment or may be represented by later execution-outcome evidence.</w:t>
       </w:r>
     </w:p>
     <w:p/>
@@ -10831,7 +11460,7 @@
     </w:p>
     <w:p>
       <w:r>
-        <w:t>Following successful Commit Boundary processing, the governed Action executes within the execution environment.</w:t>
+        <w:t>Following successful commitment, the governed target realizes the accepted transition within the execution environment. Where commitment and operational completion are distinct, the target outcome is separately evidenced.</w:t>
       </w:r>
     </w:p>
     <w:p>
@@ -11303,7 +11932,7 @@
     <w:p/>
     <w:p>
       <w:r>
-        <w:t>At the Commit Boundary, final governance realization includes current Canonical State Resolution, State Qualification, Evidence Qualification, Authority Re-Derivation, Governance Binding Validation, Commit-Bound Admissibility, and application of the resulting decision through a Policy Enforcement Point using sufficient Enforcement Context. The decision-to-enforcement relationship remains protected by Governance Enforcement Binding.</w:t>
+        <w:t>Immediately before the Commit Boundary, final Governance Realization includes current Canonical State Resolution, State Qualification, Evidence Qualification, Authority Re-Derivation, Governance Binding Validation, and Commit-Bound Admissibility. The Governance Realization Function applies the controlling PEP Profile or equivalent enforcement mapping, constructs sufficient Enforcement Context, and presents the exact commit-eligible transition to the Policy Enforcement Point. The decision-to-authorization-to-realization-to-enforcement relationship remains protected by Governance Enforcement Binding.</w:t>
       </w:r>
     </w:p>
     <w:p/>
@@ -11941,7 +12570,7 @@
     </w:p>
     <w:p>
       <w:r>
-        <w:t>Execution Authorization validates that governance decisions remain executable immediately prior to Commit Boundary processing.</w:t>
+        <w:t>Execution Authorization records that the authorization evaluation horizon has been satisfied and preserves the integrity of the Governance Decision while the proposal proceeds toward Governance Realization. It does not establish current commit eligibility.</w:t>
       </w:r>
     </w:p>
     <w:p>
@@ -11964,7 +12593,7 @@
     </w:p>
     <w:p>
       <w:r>
-        <w:t>Execution authorization is bound to execution only at the Commit Boundary.</w:t>
+        <w:t>Current commit eligibility, Execution Authorization, and the exact governed transition are bound to the protected enforcement path at the Commit Boundary.</w:t>
       </w:r>
     </w:p>
     <w:p>
@@ -11974,7 +12603,21 @@
     </w:p>
     <w:p>
       <w:r>
-        <w:t>The Commit Boundary represents the sole architectural transition between authorized intent and governed execution.</w:t>
+        <w:t>Within the claimed enforcement scope, the Commit Boundary represents the protected architectural transition from current commit eligibility to PEP-mediated application of the governed transition.</w:t>
+      </w:r>
+    </w:p>
+    <w:p>
+      <w:pPr>
+        <w:pStyle w:val="Heading3"/>
+      </w:pPr>
+      <w:r>
+        <w:t>B.3.4A Governance Enforcement Binding Integrity</w:t>
+      </w:r>
+    </w:p>
+    <w:p>
+      <w:pPr/>
+      <w:r>
+        <w:t>Governance Enforcement Binding preserves the association among the proposal, Governance Decision, Execution Authorization, current commitment basis, enforcement mapping, Enforcement Context, PEP decision, and governed consequence so that no wider, substituted, detached, replayed, or bypassed effect is accepted.</w:t>
       </w:r>
     </w:p>
     <w:p/>
@@ -12274,108 +12917,53 @@
     </w:p>
     <w:p>
       <w:r>
-        <w:t xml:space="preserve">                    Deterministic Governance</w:t>
-      </w:r>
-      <w:r>
+        <w:t>Governance Decision Integrity</w:t>
         <w:br/>
-        <w:t xml:space="preserve">                              │</w:t>
-      </w:r>
-      <w:r>
+        <w:t xml:space="preserve">                       │</w:t>
         <w:br/>
-        <w:t xml:space="preserve">        ┌─────────────────────┼─────────────────────┐</w:t>
-      </w:r>
-      <w:r>
+        <w:t xml:space="preserve">                       ▼</w:t>
         <w:br/>
-        <w:t xml:space="preserve">        │                     │                     │</w:t>
-      </w:r>
-      <w:r>
+        <w:t xml:space="preserve">              Execution Authorization Integrity</w:t>
         <w:br/>
-      </w:r>
-      <w:r>
-        <w:lastRenderedPageBreak/>
-        <w:t>Governance Decision    Canonical State     Governance Configuration</w:t>
-      </w:r>
-      <w:r>
+        <w:t xml:space="preserve">                       │</w:t>
         <w:br/>
-        <w:t>Integrity                 Integrity             Integrity</w:t>
-      </w:r>
-      <w:r>
+        <w:t xml:space="preserve">                       ▼</w:t>
         <w:br/>
-        <w:t xml:space="preserve">        │                     │                     │</w:t>
-      </w:r>
-      <w:r>
+        <w:t xml:space="preserve">            Governance Realization Integrity</w:t>
         <w:br/>
-        <w:t xml:space="preserve">        └──────────────┬──────┴──────┬──────────────┘</w:t>
-      </w:r>
-      <w:r>
+        <w:t xml:space="preserve">                       │</w:t>
         <w:br/>
-        <w:t xml:space="preserve">                       │             │</w:t>
-      </w:r>
-      <w:r>
+        <w:t xml:space="preserve">                       ▼</w:t>
         <w:br/>
-        <w:t xml:space="preserve">             Execution Authorization │</w:t>
-      </w:r>
-      <w:r>
+        <w:t xml:space="preserve">        Governance Enforcement Binding Integrity</w:t>
         <w:br/>
-        <w:t xml:space="preserve">                     Integrity        │</w:t>
-      </w:r>
-      <w:r>
+        <w:t xml:space="preserve">                       │</w:t>
         <w:br/>
-        <w:t xml:space="preserve">                       │             │</w:t>
-      </w:r>
-      <w:r>
-        <w:br/>
-        <w:t xml:space="preserve">                       ▼             ▼</w:t>
-      </w:r>
-      <w:r>
+        <w:t xml:space="preserve">                       ▼</w:t>
         <w:br/>
         <w:t xml:space="preserve">                 Commit Boundary Integrity</w:t>
-      </w:r>
-      <w:r>
         <w:br/>
         <w:t xml:space="preserve">                       │</w:t>
-      </w:r>
-      <w:r>
         <w:br/>
         <w:t xml:space="preserve">                       ▼</w:t>
-      </w:r>
-      <w:r>
         <w:br/>
-        <w:t xml:space="preserve">                Governed Execution</w:t>
-      </w:r>
-      <w:r>
+        <w:t xml:space="preserve">              PEP-Mediated Governed Transition</w:t>
         <w:br/>
         <w:t xml:space="preserve">                       │</w:t>
-      </w:r>
-      <w:r>
         <w:br/>
         <w:t xml:space="preserve">                       ▼</w:t>
-      </w:r>
-      <w:r>
         <w:br/>
         <w:t xml:space="preserve">              Governance Evidence Integrity</w:t>
-      </w:r>
-      <w:r>
         <w:br/>
         <w:t xml:space="preserve">                       │</w:t>
-      </w:r>
-      <w:r>
         <w:br/>
         <w:t xml:space="preserve">                       ▼</w:t>
-      </w:r>
-      <w:r>
         <w:br/>
         <w:t xml:space="preserve">              Authority Lineage Integrity</w:t>
-      </w:r>
-      <w:r>
         <w:br/>
         <w:t xml:space="preserve">                       │</w:t>
-      </w:r>
-      <w:r>
         <w:br/>
         <w:t xml:space="preserve">                       ▼</w:t>
-      </w:r>
-      <w:r>
         <w:br/>
         <w:t xml:space="preserve">       Tenant &amp; Governance Domain Isolation</w:t>
       </w:r>
@@ -13679,12 +14267,12 @@
         </w:rPr>
       </w:pPr>
       <w:r>
-        <w:t>Governance Decision Function</w:t>
-      </w:r>
-    </w:p>
-    <w:p>
-      <w:r>
-        <w:t>Responsible for evaluating governance policy using authoritative governance information.</w:t>
+        <w:t>Governance Decision Function / PDP</w:t>
+      </w:r>
+    </w:p>
+    <w:p>
+      <w:r>
+        <w:t>Responsible for evaluating governance policy using qualified authoritative governance information and rendering the Governance Decision.</w:t>
       </w:r>
     </w:p>
     <w:p>
@@ -13749,7 +14337,7 @@
     </w:p>
     <w:p>
       <w:r>
-        <w:t>The Governance Decision Function does not authorize execution.</w:t>
+        <w:t>The Governance Decision Function / PDP does not establish current commit eligibility or perform enforcement.</w:t>
       </w:r>
     </w:p>
     <w:p/>
@@ -13766,7 +14354,7 @@
     </w:p>
     <w:p>
       <w:r>
-        <w:t>Responsible for determining whether execution remains authorized immediately before Commit Boundary processing.</w:t>
+        <w:t>Responsible for recording that the authorization evaluation horizon has been satisfied and that the proposal may proceed toward later current-authority and Commit-Bound Admissibility processing.</w:t>
       </w:r>
     </w:p>
     <w:p>
@@ -13831,7 +14419,92 @@
     </w:p>
     <w:p>
       <w:r>
-        <w:t>Execution Authorization does not perform policy evaluation.</w:t>
+        <w:t>Execution Authorization does not perform policy evaluation, current commit-time Authority Re-Derivation, or enforcement.</w:t>
+      </w:r>
+    </w:p>
+    <w:p>
+      <w:r>
+        <w:t>Governance Realization Function</w:t>
+      </w:r>
+    </w:p>
+    <w:p>
+      <w:r>
+        <w:t>Responsible for establishing current Commit-Bound Admissibility for the exact authorized transition immediately before enforcement.</w:t>
+      </w:r>
+    </w:p>
+    <w:p>
+      <w:r>
+        <w:t>Typical activities include:</w:t>
+      </w:r>
+    </w:p>
+    <w:p>
+      <w:r>
+        <w:t>current Canonical State and evidence qualification;</w:t>
+      </w:r>
+    </w:p>
+    <w:p>
+      <w:r>
+        <w:t>Authority Re-Derivation, including current identity-bound authorization or entitlements where applicable;</w:t>
+      </w:r>
+    </w:p>
+    <w:p>
+      <w:r>
+        <w:t>Governance Binding Validation;</w:t>
+      </w:r>
+    </w:p>
+    <w:p>
+      <w:r>
+        <w:t>PEP Profile or equivalent enforcement-mapping application; and</w:t>
+      </w:r>
+    </w:p>
+    <w:p>
+      <w:r>
+        <w:t>Enforcement Context construction.</w:t>
+      </w:r>
+    </w:p>
+    <w:p>
+      <w:r>
+        <w:t>The Governance Realization Function does not reinterpret the Governance Decision into a broader or different operation.</w:t>
+      </w:r>
+    </w:p>
+    <w:p>
+      <w:r>
+        <w:t>Policy Enforcement Point</w:t>
+      </w:r>
+    </w:p>
+    <w:p>
+      <w:r>
+        <w:t>Responsible for controlling whether the exact commit-eligible transition crosses the enforcement boundary.</w:t>
+      </w:r>
+    </w:p>
+    <w:p>
+      <w:r>
+        <w:t>Typical activities include:</w:t>
+      </w:r>
+    </w:p>
+    <w:p>
+      <w:r>
+        <w:t>validating the execution-relevant Enforcement Context;</w:t>
+      </w:r>
+    </w:p>
+    <w:p>
+      <w:r>
+        <w:t>validating Governance Enforcement Binding;</w:t>
+      </w:r>
+    </w:p>
+    <w:p>
+      <w:r>
+        <w:t>refusing unsupported, stale, replayed, widened, or mismatched transitions; and</w:t>
+      </w:r>
+    </w:p>
+    <w:p>
+      <w:r>
+        <w:t>mediating the protected target operation.</w:t>
+      </w:r>
+    </w:p>
+    <w:p>
+      <w:r>
+        <w:t>The Policy Enforcement Point does not replace the Governance Decision Function or Governance Realization Function.</w:t>
       </w:r>
     </w:p>
     <w:p/>
@@ -13849,7 +14522,7 @@
     </w:p>
     <w:p>
       <w:r>
-        <w:t>Responsible for binding authoritative execution authorization to execution.</w:t>
+        <w:t>Represents the protected architectural boundary at which the exact commit-eligible transition is accepted into the PEP-mediated execution path or prevented from producing the governed consequence.</w:t>
       </w:r>
     </w:p>
     <w:p>
@@ -13865,7 +14538,7 @@
         </w:numPr>
       </w:pPr>
       <w:r>
-        <w:t xml:space="preserve">authorization validation; </w:t>
+        <w:t>current commit-result and enforcement-binding validation;</w:t>
       </w:r>
     </w:p>
     <w:p>
@@ -13876,7 +14549,7 @@
         </w:numPr>
       </w:pPr>
       <w:r>
-        <w:t xml:space="preserve">final admissibility verification; </w:t>
+        <w:t>protected-boundary admission;</w:t>
       </w:r>
     </w:p>
     <w:p>
@@ -13887,7 +14560,7 @@
         </w:numPr>
       </w:pPr>
       <w:r>
-        <w:t xml:space="preserve">authorization binding; </w:t>
+        <w:t>Governance Enforcement Binding preservation;</w:t>
       </w:r>
     </w:p>
     <w:p>
@@ -13909,12 +14582,12 @@
         </w:numPr>
       </w:pPr>
       <w:r>
-        <w:t xml:space="preserve">transition to governed execution. </w:t>
-      </w:r>
-    </w:p>
-    <w:p>
-      <w:r>
-        <w:t>The Commit Boundary does not generate new governance decisions.</w:t>
+        <w:t>transition to governed target realization.</w:t>
+      </w:r>
+    </w:p>
+    <w:p>
+      <w:r>
+        <w:t>The Commit Boundary is a boundary, not a general policy-decision function; it does not generate a broader Governance Decision.</w:t>
       </w:r>
     </w:p>
     <w:p/>
@@ -14020,105 +14693,66 @@
     <w:p>
       <w:r>
         <w:t>Proposal Qualification</w:t>
-      </w:r>
-      <w:r>
         <w:br/>
         <w:t xml:space="preserve"> │</w:t>
-      </w:r>
-      <w:r>
         <w:br/>
         <w:t xml:space="preserve"> ▼</w:t>
-      </w:r>
-      <w:r>
         <w:br/>
         <w:t>Structural Admissibility</w:t>
-      </w:r>
-      <w:r>
         <w:br/>
         <w:t xml:space="preserve"> │</w:t>
-      </w:r>
-      <w:r>
         <w:br/>
         <w:t xml:space="preserve"> ▼</w:t>
-      </w:r>
-      <w:r>
         <w:br/>
-        <w:t>Governance Decision Function</w:t>
-      </w:r>
-      <w:r>
+        <w:t>Governance Decision Function / PDP</w:t>
         <w:br/>
         <w:t xml:space="preserve"> │</w:t>
-      </w:r>
-      <w:r>
         <w:br/>
         <w:t xml:space="preserve"> ▼</w:t>
-      </w:r>
-      <w:r>
         <w:br/>
-        <w:t>Policy Evaluation</w:t>
-      </w:r>
-      <w:r>
+        <w:t>Governance Decision</w:t>
         <w:br/>
         <w:t xml:space="preserve"> │</w:t>
-      </w:r>
-      <w:r>
         <w:br/>
         <w:t xml:space="preserve"> ▼</w:t>
-      </w:r>
-      <w:r>
         <w:br/>
         <w:t>Execution Authorization / Eligible Nonterminal State</w:t>
-      </w:r>
-      <w:r>
         <w:br/>
-      </w:r>
-      <w:r>
-        <w:lastRenderedPageBreak/>
         <w:t xml:space="preserve"> │</w:t>
-      </w:r>
-      <w:r>
         <w:br/>
         <w:t xml:space="preserve"> ▼</w:t>
-      </w:r>
-      <w:r>
         <w:br/>
         <w:t>Continuation Integrity as applicable</w:t>
-      </w:r>
-      <w:r>
         <w:br/>
         <w:t xml:space="preserve"> │</w:t>
-      </w:r>
-      <w:r>
         <w:br/>
         <w:t xml:space="preserve"> ▼</w:t>
-      </w:r>
-      <w:r>
         <w:br/>
-        <w:t>Governance Realization, Commit-Bound Admissibility, and Enforcement</w:t>
-      </w:r>
-      <w:r>
+        <w:t>Governance Realization / Commit-Bound Admissibility</w:t>
         <w:br/>
         <w:t xml:space="preserve"> │</w:t>
-      </w:r>
-      <w:r>
         <w:br/>
         <w:t xml:space="preserve"> ▼</w:t>
-      </w:r>
-      <w:r>
         <w:br/>
-        <w:t>Commit Boundary</w:t>
-      </w:r>
-      <w:r>
+        <w:t>PEP Profile / Enforcement Context</w:t>
         <w:br/>
         <w:t xml:space="preserve"> │</w:t>
-      </w:r>
-      <w:r>
         <w:br/>
         <w:t xml:space="preserve"> ▼</w:t>
-      </w:r>
-      <w:r>
         <w:br/>
-        <w:t>Governed Execution</w:t>
+        <w:t>Policy Enforcement Point</w:t>
+        <w:br/>
+        <w:t xml:space="preserve"> │</w:t>
+        <w:br/>
+        <w:t xml:space="preserve"> ▼</w:t>
+        <w:br/>
+        <w:t>Commit Boundary Crossing</w:t>
+        <w:br/>
+        <w:t xml:space="preserve"> │</w:t>
+        <w:br/>
+        <w:t xml:space="preserve"> ▼</w:t>
+        <w:br/>
+        <w:t>Governed Target Realization</w:t>
       </w:r>
     </w:p>
     <w:p>
@@ -15278,7 +15912,7 @@
     </w:p>
     <w:p>
       <w:r>
-        <w:t>Execution Authorization validates authority and execution prerequisites.</w:t>
+        <w:t>Execution Authorization validates the authority and execution prerequisites applicable to its evaluation horizon and records eligibility to proceed toward Governance Realization; it does not establish current commit eligibility.</w:t>
       </w:r>
     </w:p>
     <w:p>
@@ -15447,12 +16081,12 @@
         </w:rPr>
       </w:pPr>
       <w:r>
-        <w:t>D.6 Commit Boundary Outcomes</w:t>
-      </w:r>
-    </w:p>
-    <w:p>
-      <w:r>
-        <w:t>Commit Boundary processing binds execution authorization to execution.</w:t>
+        <w:t>D.6 Governance Realization and Commit Boundary Outcomes</w:t>
+      </w:r>
+    </w:p>
+    <w:p>
+      <w:r>
+        <w:t>Governance Realization establishes current Commit-Bound Admissibility and produces the enforcement-facing bindings used by the Policy Enforcement Point at the Commit Boundary.</w:t>
       </w:r>
     </w:p>
     <w:p>
@@ -15608,7 +16242,7 @@
     </w:tbl>
     <w:p>
       <w:r>
-        <w:t>Commit Successful establishes the authoritative transition from authorized intent to governed execution.</w:t>
+        <w:t>Commit Successful establishes the authoritative commitment event at which the exact governed transition is accepted for application to the intended target. A later operational outcome may be separately evidenced when commitment and execution completion are distinct.</w:t>
       </w:r>
     </w:p>
     <w:p/>
@@ -16232,165 +16866,84 @@
     <w:p>
       <w:r>
         <w:t>Proposal</w:t>
-      </w:r>
-      <w:r>
         <w:br/>
         <w:t xml:space="preserve">    │</w:t>
-      </w:r>
-      <w:r>
         <w:br/>
         <w:t xml:space="preserve">    ▼</w:t>
-      </w:r>
-      <w:r>
         <w:br/>
         <w:t>Qualified Proposal</w:t>
-      </w:r>
-      <w:r>
         <w:br/>
         <w:t xml:space="preserve">    │</w:t>
-      </w:r>
-      <w:r>
         <w:br/>
         <w:t xml:space="preserve">    ▼</w:t>
-      </w:r>
-      <w:r>
         <w:br/>
-      </w:r>
-      <w:r>
-        <w:lastRenderedPageBreak/>
         <w:t>Governance Decision</w:t>
-      </w:r>
-      <w:r>
         <w:br/>
         <w:t xml:space="preserve">    │</w:t>
-      </w:r>
-      <w:r>
         <w:br/>
         <w:t xml:space="preserve">    ├── Authorized</w:t>
-      </w:r>
-      <w:r>
         <w:br/>
         <w:t xml:space="preserve">    ├── Denied</w:t>
-      </w:r>
-      <w:r>
         <w:br/>
         <w:t xml:space="preserve">    ├── Structural Refusal</w:t>
-      </w:r>
-      <w:r>
         <w:br/>
         <w:t xml:space="preserve">    ├── Pending Human Review</w:t>
-      </w:r>
-      <w:r>
         <w:br/>
         <w:t xml:space="preserve">    ├── Deferred</w:t>
-      </w:r>
-      <w:r>
         <w:br/>
         <w:t xml:space="preserve">    └── Governed Re-evaluation</w:t>
-      </w:r>
-      <w:r>
         <w:br/>
         <w:t xml:space="preserve">              │</w:t>
-      </w:r>
-      <w:r>
         <w:br/>
         <w:t xml:space="preserve">              ▼</w:t>
-      </w:r>
-      <w:r>
         <w:br/>
         <w:t>Execution Authorization</w:t>
-      </w:r>
-      <w:r>
         <w:br/>
         <w:t xml:space="preserve">              │</w:t>
-      </w:r>
-      <w:r>
         <w:br/>
         <w:t xml:space="preserve">      ├── Authorized</w:t>
-      </w:r>
-      <w:r>
         <w:br/>
         <w:t xml:space="preserve">      ├── Authorization Failure</w:t>
-      </w:r>
-      <w:r>
         <w:br/>
         <w:t xml:space="preserve">      └── Governed Re-evaluation</w:t>
-      </w:r>
-      <w:r>
         <w:br/>
         <w:t xml:space="preserve">              │</w:t>
-      </w:r>
-      <w:r>
         <w:br/>
         <w:t xml:space="preserve">              ▼</w:t>
-      </w:r>
-      <w:r>
         <w:br/>
-        <w:t>Commit Boundary</w:t>
-      </w:r>
-      <w:r>
+        <w:t>Continuation Integrity as applicable</w:t>
         <w:br/>
         <w:t xml:space="preserve">              │</w:t>
-      </w:r>
-      <w:r>
+        <w:br/>
+        <w:t xml:space="preserve">              ▼</w:t>
+        <w:br/>
+        <w:t>Governance Realization / Commit-Bound Admissibility</w:t>
+        <w:br/>
+        <w:t xml:space="preserve">              │</w:t>
+        <w:br/>
+        <w:t xml:space="preserve">              ▼</w:t>
+        <w:br/>
+        <w:t>Policy Enforcement Point / Commit Boundary</w:t>
+        <w:br/>
+        <w:t xml:space="preserve">              │</w:t>
         <w:br/>
         <w:t xml:space="preserve">      ├── Commit Successful</w:t>
-      </w:r>
-      <w:r>
         <w:br/>
         <w:t xml:space="preserve">      ├── Commit Failed</w:t>
-      </w:r>
-      <w:r>
         <w:br/>
         <w:t xml:space="preserve">      └── Governed Re-evaluation</w:t>
-      </w:r>
-      <w:r>
         <w:br/>
         <w:t xml:space="preserve">              │</w:t>
-      </w:r>
-      <w:r>
         <w:br/>
         <w:t xml:space="preserve">              ▼</w:t>
-      </w:r>
-      <w:r>
         <w:br/>
-        <w:t>Governed Execution</w:t>
-      </w:r>
-      <w:r>
+        <w:t>Governed Target Realization</w:t>
         <w:br/>
         <w:t xml:space="preserve">              │</w:t>
-      </w:r>
-      <w:r>
         <w:br/>
         <w:t xml:space="preserve">              ▼</w:t>
-      </w:r>
-      <w:r>
         <w:br/>
-        <w:t>Continuation Integrity</w:t>
-      </w:r>
-      <w:r>
-        <w:br/>
-        <w:t xml:space="preserve">      │</w:t>
-      </w:r>
-      <w:r>
-        <w:br/>
-        <w:t xml:space="preserve">      ├── Continue</w:t>
-      </w:r>
-      <w:r>
-        <w:br/>
-        <w:t xml:space="preserve">      ├── DEGRADED</w:t>
-      </w:r>
-      <w:r>
-        <w:br/>
-        <w:t xml:space="preserve">      ├── Suspend</w:t>
-      </w:r>
-      <w:r>
-        <w:br/>
-        <w:t xml:space="preserve">      ├── Resume</w:t>
-      </w:r>
-      <w:r>
-        <w:br/>
-        <w:t xml:space="preserve">      └── Terminate</w:t>
+        <w:t>Execution Outcome / Evidence</w:t>
       </w:r>
     </w:p>
     <w:p>
@@ -16937,135 +17490,79 @@
       </w:r>
     </w:p>
     <w:p>
+      <w:pPr/>
+      <w:r>
+        <w:t>Runtime Governance Engineering Volume 1 provides explanatory architectural context. The AGCP Trust Model and Architecture Reference Model translate that context into AGCP architectural trust, authority, vocabulary, and relationship models. Normative obligations remain controlled by the Runtime Governance Conformance Requirements, this Core Specification, and applicable normative Companion Specifications according to Section 3.3.</w:t>
+      </w:r>
+    </w:p>
+    <w:p>
       <w:r>
         <w:t>The AGCP specification ecosystem is organized as follows.</w:t>
       </w:r>
     </w:p>
     <w:p>
       <w:r>
-        <w:t>Runtime Governance Body of Knowledge</w:t>
-      </w:r>
-      <w:r>
+        <w:t>Runtime Governance Engineering Volume 1</w:t>
         <w:br/>
-        <w:t xml:space="preserve">  Non-normative conceptual and explanatory foundation</w:t>
-      </w:r>
-      <w:r>
+        <w:t xml:space="preserve">  Non-normative explanatory foundation</w:t>
         <w:br/>
         <w:t xml:space="preserve">                                │</w:t>
-      </w:r>
-      <w:r>
         <w:br/>
         <w:t xml:space="preserve">                                ▼</w:t>
-      </w:r>
-      <w:r>
         <w:br/>
-        <w:t>Architecture Reference Model</w:t>
-      </w:r>
-      <w:r>
+        <w:t>AGCP Trust Model + Architecture Reference Model</w:t>
         <w:br/>
-        <w:t xml:space="preserve">  Authoritative architectural vocabulary; non-normative</w:t>
-      </w:r>
-      <w:r>
+        <w:t xml:space="preserve">  Non-normative trust model and authoritative architectural vocabulary</w:t>
         <w:br/>
         <w:t xml:space="preserve">                                │</w:t>
-      </w:r>
-      <w:r>
         <w:br/>
         <w:t xml:space="preserve">                                ▼</w:t>
-      </w:r>
-      <w:r>
         <w:br/>
         <w:t>Runtime Governance Conformance Requirements (CRs)</w:t>
-      </w:r>
-      <w:r>
         <w:br/>
         <w:t xml:space="preserve">  Controlled normative capability requirements</w:t>
-      </w:r>
-      <w:r>
         <w:br/>
         <w:t xml:space="preserve">                                │</w:t>
-      </w:r>
-      <w:r>
         <w:br/>
         <w:t xml:space="preserve">                                ▼</w:t>
-      </w:r>
-      <w:r>
         <w:br/>
         <w:t>AGCP Core Specification</w:t>
-      </w:r>
-      <w:r>
         <w:br/>
         <w:t xml:space="preserve">  Normative runtime behavior</w:t>
-      </w:r>
-      <w:r>
         <w:br/>
         <w:t xml:space="preserve">                                │</w:t>
-      </w:r>
-      <w:r>
         <w:br/>
         <w:t xml:space="preserve">                                ▼</w:t>
-      </w:r>
-      <w:r>
         <w:br/>
         <w:t>AGCP Normative Statements</w:t>
-      </w:r>
-      <w:r>
         <w:br/>
         <w:t xml:space="preserve">  Extracted atomic normative obligations</w:t>
-      </w:r>
-      <w:r>
         <w:br/>
         <w:t xml:space="preserve">                                │</w:t>
-      </w:r>
-      <w:r>
         <w:br/>
         <w:t xml:space="preserve">                                ▼</w:t>
-      </w:r>
-      <w:r>
         <w:br/>
         <w:t>Requirements Traceability Matrix (RTM)</w:t>
-      </w:r>
-      <w:r>
         <w:br/>
         <w:t xml:space="preserve">  Complete traceability relationships</w:t>
-      </w:r>
-      <w:r>
         <w:br/>
         <w:t xml:space="preserve">                │                           │</w:t>
-      </w:r>
-      <w:r>
         <w:br/>
         <w:t xml:space="preserve">                ▼                           ▼</w:t>
-      </w:r>
-      <w:r>
         <w:br/>
         <w:t>Conformance Test Suite         Assessment Framework</w:t>
-      </w:r>
-      <w:r>
         <w:br/>
         <w:t xml:space="preserve">                │                           │</w:t>
-      </w:r>
-      <w:r>
         <w:br/>
         <w:t xml:space="preserve">                └──────────────┬────────────┘</w:t>
-      </w:r>
-      <w:r>
         <w:br/>
         <w:t xml:space="preserve">                               ▼</w:t>
-      </w:r>
-      <w:r>
         <w:br/>
         <w:t xml:space="preserve">                     Conformance Assessment</w:t>
-      </w:r>
-      <w:r>
         <w:br/>
         <w:t xml:space="preserve">                               │</w:t>
-      </w:r>
-      <w:r>
         <w:br/>
         <w:t xml:space="preserve">                               ▼</w:t>
-      </w:r>
-      <w:r>
         <w:br/>
         <w:t xml:space="preserve">                     Conformance Claim</w:t>
       </w:r>
@@ -17618,6 +18115,28 @@
       </w:pPr>
       <w:r>
         <w:t xml:space="preserve">Implementation Profiles; </w:t>
+      </w:r>
+    </w:p>
+    <w:p>
+      <w:pPr>
+        <w:numPr>
+          <w:ilvl w:val="0"/>
+          <w:numId w:val="107"/>
+        </w:numPr>
+      </w:pPr>
+      <w:r>
+        <w:t>IAS Profile declarations for authoritative identity, authorization, and entitlement sources;</w:t>
+      </w:r>
+    </w:p>
+    <w:p>
+      <w:pPr>
+        <w:numPr>
+          <w:ilvl w:val="0"/>
+          <w:numId w:val="107"/>
+        </w:numPr>
+      </w:pPr>
+      <w:r>
+        <w:t>PEP Profile declarations or equivalent enforcement mappings;</w:t>
       </w:r>
     </w:p>
     <w:p>
@@ -18764,6 +19283,11 @@
         <w:t>Implementation Profiles identify which optional capabilities are applicable while preserving mandatory Core Specification behavior.</w:t>
       </w:r>
     </w:p>
+    <w:p>
+      <w:r>
+        <w:t>Where applicable, Implementation Profiles also identify authoritative identity and entitlement sources and their IAS Profiles, Governance Decision Function / Governance Realization placement, PEP Profiles or equivalent enforcement mappings, protected GRF-to-PEP bindings, and the target-specific meaning of commitment versus later operational completion.</w:t>
+      </w:r>
+    </w:p>
     <w:p/>
     <w:p>
       <w:pPr>
@@ -19398,8 +19922,7 @@
         </w:numPr>
       </w:pPr>
       <w:r>
-        <w:lastRenderedPageBreak/>
-        <w:t xml:space="preserve">Commit Boundary semantics; </w:t>
+        <w:t>Governance Realization, Commit Boundary, and Policy Enforcement Point semantics;</w:t>
       </w:r>
     </w:p>
     <w:p>
@@ -19767,6 +20290,17 @@
       </w:pPr>
       <w:r>
         <w:t xml:space="preserve">Architecture Reference Model </w:t>
+      </w:r>
+    </w:p>
+    <w:p>
+      <w:pPr>
+        <w:numPr>
+          <w:ilvl w:val="0"/>
+          <w:numId w:val="121"/>
+        </w:numPr>
+      </w:pPr>
+      <w:r>
+        <w:t>AGCP Trust Model</w:t>
       </w:r>
     </w:p>
     <w:p>
@@ -20401,94 +20935,52 @@
     </w:p>
     <w:p>
       <w:r>
-        <w:t>The ecosystem distinguishes conceptual derivation from normative precedence. Conceptual derivation proceeds from the BoK through the ARM to the Core, while normative precedence is governed by Section 3.3.</w:t>
-      </w:r>
-    </w:p>
-    <w:p>
-      <w:r>
-        <w:t>Conceptual Derivation</w:t>
-      </w:r>
-      <w:r>
-        <w:br/>
-      </w:r>
-      <w:r>
-        <w:br/>
-      </w:r>
-      <w:r>
-        <w:lastRenderedPageBreak/>
-        <w:t>Runtime Governance Body of Knowledge</w:t>
-      </w:r>
-      <w:r>
+        <w:t>The ecosystem distinguishes conceptual derivation from normative precedence. Conceptual derivation proceeds from Runtime Governance Engineering Volume 1 through the AGCP Trust Model and ARM to the Core, while normative precedence is governed by Section 3.3.</w:t>
+      </w:r>
+    </w:p>
+    <w:p>
+      <w:r>
+        <w:t>Runtime Governance Engineering Volume 1</w:t>
         <w:br/>
         <w:t xml:space="preserve">                │</w:t>
-      </w:r>
-      <w:r>
         <w:br/>
         <w:t xml:space="preserve">                ▼</w:t>
-      </w:r>
-      <w:r>
+        <w:br/>
+        <w:t xml:space="preserve">        AGCP Trust Model</w:t>
+        <w:br/>
+        <w:t xml:space="preserve">                │</w:t>
+        <w:br/>
+        <w:t xml:space="preserve">                ▼</w:t>
         <w:br/>
         <w:t>Architecture Reference Model</w:t>
-      </w:r>
-      <w:r>
         <w:br/>
         <w:t xml:space="preserve">                │</w:t>
-      </w:r>
-      <w:r>
         <w:br/>
         <w:t xml:space="preserve">                ▼</w:t>
-      </w:r>
-      <w:r>
         <w:br/>
         <w:t>Core Specification and supporting artifacts</w:t>
-      </w:r>
-      <w:r>
         <w:br/>
-      </w:r>
-      <w:r>
         <w:br/>
         <w:t>Normative Precedence</w:t>
-      </w:r>
-      <w:r>
         <w:br/>
-      </w:r>
-      <w:r>
         <w:br/>
         <w:t>Runtime Governance Conformance Requirements</w:t>
-      </w:r>
-      <w:r>
         <w:br/>
         <w:t xml:space="preserve">                │</w:t>
-      </w:r>
-      <w:r>
         <w:br/>
         <w:t xml:space="preserve">                ▼</w:t>
-      </w:r>
-      <w:r>
         <w:br/>
         <w:t>Core Specification</w:t>
-      </w:r>
-      <w:r>
         <w:br/>
         <w:t xml:space="preserve">                │</w:t>
-      </w:r>
-      <w:r>
         <w:br/>
         <w:t xml:space="preserve">                ▼</w:t>
-      </w:r>
-      <w:r>
         <w:br/>
         <w:t>Applicable normative Companion Specifications</w:t>
-      </w:r>
-      <w:r>
         <w:br/>
         <w:t xml:space="preserve">                │</w:t>
-      </w:r>
-      <w:r>
         <w:br/>
         <w:t xml:space="preserve">                ▼</w:t>
-      </w:r>
-      <w:r>
         <w:br/>
         <w:t>Conformance Test Suite and Assessment Framework</w:t>
       </w:r>
@@ -21067,7 +21559,7 @@
     </w:p>
     <w:p>
       <w:r>
-        <w:t>Ensure that every governance-significant action is deterministically evaluated, authorized, committed, and evidenced before execution occurs.</w:t>
+        <w:t>Ensure that every governance-significant action is deterministically evaluated, authorized, revalidated for current commit eligibility, mediated through enforcement, and evidenced before a governed consequence occurs.</w:t>
       </w:r>
     </w:p>
     <w:p>
@@ -21101,7 +21593,7 @@
     </w:p>
     <w:p>
       <w:r>
-        <w:t>Governance decisions are established before commitment, but prior decisions and authorization artifacts do not become portable execution authority; final admissibility and authority are resolved from current qualified governance inputs at the Commit Boundary.</w:t>
+        <w:t>Governance decisions are established by the Governance Decision Function / PDP before commitment, but prior decisions and authorization artifacts do not become portable execution authority; final current authority and Commit-Bound Admissibility are resolved by the Governance Realization Function from current qualified governance inputs immediately before Policy Enforcement Point mediation at the Commit Boundary.</w:t>
       </w:r>
     </w:p>
     <w:p>
@@ -21461,7 +21953,7 @@
     </w:p>
     <w:p>
       <w:r>
-        <w:t>Execution-layer governance ensures that governance decisions directly influence the transition from authorized intent to governed execution.</w:t>
+        <w:t>Execution-layer governance ensures that Governance Decisions, current Governance Realization, and PEP-mediated enforcement directly control the transition from authorized intent to governed target realization.</w:t>
       </w:r>
     </w:p>
     <w:p/>
@@ -21734,7 +22226,7 @@
         </w:numPr>
       </w:pPr>
       <w:r>
-        <w:t xml:space="preserve">the Governance Decision Function evaluates qualified governance inputs; </w:t>
+        <w:t>the Governance Decision Function, acting in the PDP role, evaluates qualified governance inputs and renders the Governance Decision;</w:t>
       </w:r>
     </w:p>
     <w:p>
@@ -21745,7 +22237,7 @@
         </w:numPr>
       </w:pPr>
       <w:r>
-        <w:t xml:space="preserve">authorization records a prior governance result; </w:t>
+        <w:t>Execution Authorization records a prior favorable governance result without establishing current commit eligibility;</w:t>
       </w:r>
     </w:p>
     <w:p>
@@ -21756,7 +22248,18 @@
         </w:numPr>
       </w:pPr>
       <w:r>
-        <w:t xml:space="preserve">the Governance Realization Function resolves final Commit-Bound Admissibility and provides Enforcement Context to the Policy Enforcement Point; and </w:t>
+        <w:t>the Governance Realization Function re-derives current authority, resolves final Commit-Bound Admissibility, applies the controlling PEP Profile or equivalent enforcement mapping, and provides the exact transition and Enforcement Context to the Policy Enforcement Point;</w:t>
+      </w:r>
+    </w:p>
+    <w:p>
+      <w:pPr>
+        <w:numPr>
+          <w:ilvl w:val="0"/>
+          <w:numId w:val="132"/>
+        </w:numPr>
+      </w:pPr>
+      <w:r>
+        <w:t>the Policy Enforcement Point controls whether the exact commit-eligible transition crosses the enforcement boundary; and</w:t>
       </w:r>
     </w:p>
     <w:p>
@@ -21800,72 +22303,43 @@
     </w:p>
     <w:p>
       <w:r>
-        <w:t>Runtime Governance Body of Knowledge</w:t>
-      </w:r>
-      <w:r>
+        <w:t>Runtime Governance Engineering Volume 1</w:t>
         <w:br/>
         <w:t xml:space="preserve">              │</w:t>
-      </w:r>
-      <w:r>
         <w:br/>
         <w:t xml:space="preserve">              ▼</w:t>
-      </w:r>
-      <w:r>
+        <w:br/>
+        <w:t xml:space="preserve">      AGCP Trust Model</w:t>
+        <w:br/>
+        <w:t xml:space="preserve">              │</w:t>
+        <w:br/>
+        <w:t xml:space="preserve">              ▼</w:t>
         <w:br/>
         <w:t>Architecture Reference Model</w:t>
-      </w:r>
-      <w:r>
         <w:br/>
         <w:t xml:space="preserve">              │</w:t>
-      </w:r>
-      <w:r>
         <w:br/>
         <w:t xml:space="preserve">              ▼</w:t>
-      </w:r>
-      <w:r>
         <w:br/>
         <w:t>Runtime Governance Conformance Requirements and Core Specification</w:t>
-      </w:r>
-      <w:r>
         <w:br/>
         <w:t xml:space="preserve">              │</w:t>
-      </w:r>
-      <w:r>
         <w:br/>
         <w:t xml:space="preserve">              ▼</w:t>
-      </w:r>
-      <w:r>
         <w:br/>
         <w:t>Normative Statements</w:t>
-      </w:r>
-      <w:r>
         <w:br/>
-      </w:r>
-      <w:r>
-        <w:lastRenderedPageBreak/>
         <w:t xml:space="preserve">              │</w:t>
-      </w:r>
-      <w:r>
         <w:br/>
         <w:t xml:space="preserve">              ▼</w:t>
-      </w:r>
-      <w:r>
         <w:br/>
         <w:t>Requirements Traceability Matrix</w:t>
-      </w:r>
-      <w:r>
         <w:br/>
         <w:t xml:space="preserve">              │</w:t>
-      </w:r>
-      <w:r>
         <w:br/>
         <w:t xml:space="preserve">      ┌───────┴────────┐</w:t>
-      </w:r>
-      <w:r>
         <w:br/>
         <w:t xml:space="preserve">      ▼                ▼</w:t>
-      </w:r>
-      <w:r>
         <w:br/>
         <w:t>Conformance Test Suite Assessment Framework</w:t>
       </w:r>

</xml_diff>